<commit_message>
docs: laporan sesuai catatan dosen
Co-Authored-By: Claude Opus 5.5 <noreply@anthropic.com>
</commit_message>
<xml_diff>
--- a/laporan/Laporan-Ringkas-Warungku.docx
+++ b/laporan/Laporan-Ringkas-Warungku.docx
@@ -55,7 +55,7 @@
           <w:b w:val="0"/>
           <w:sz w:val="24"/>
         </w:rPr>
-        <w:t>Cabang Rombak#3 — 06 October 2026</w:t>
+        <w:t>Cabang Rombak#3 — 10 Oktober 2026</w:t>
       </w:r>
     </w:p>
     <w:p/>
@@ -76,6 +76,9 @@
             <w:tcW w:type="dxa" w:w="2268"/>
           </w:tcPr>
           <w:p>
+            <w:pPr>
+              <w:jc w:val="left"/>
+            </w:pPr>
             <w:r/>
             <w:r>
               <w:rPr>
@@ -92,6 +95,9 @@
             <w:tcW w:type="dxa" w:w="6236"/>
           </w:tcPr>
           <w:p>
+            <w:pPr>
+              <w:jc w:val="left"/>
+            </w:pPr>
             <w:r/>
             <w:r>
               <w:rPr>
@@ -110,6 +116,9 @@
             <w:tcW w:type="dxa" w:w="2268"/>
           </w:tcPr>
           <w:p>
+            <w:pPr>
+              <w:jc w:val="left"/>
+            </w:pPr>
             <w:r/>
             <w:r>
               <w:rPr>
@@ -125,6 +134,9 @@
             <w:tcW w:type="dxa" w:w="6236"/>
           </w:tcPr>
           <w:p>
+            <w:pPr>
+              <w:jc w:val="left"/>
+            </w:pPr>
             <w:r/>
             <w:r>
               <w:rPr>
@@ -142,6 +154,9 @@
             <w:tcW w:type="dxa" w:w="2268"/>
           </w:tcPr>
           <w:p>
+            <w:pPr>
+              <w:jc w:val="left"/>
+            </w:pPr>
             <w:r/>
             <w:r>
               <w:rPr>
@@ -157,13 +172,16 @@
             <w:tcW w:type="dxa" w:w="6236"/>
           </w:tcPr>
           <w:p>
+            <w:pPr>
+              <w:jc w:val="left"/>
+            </w:pPr>
             <w:r/>
             <w:r>
               <w:rPr>
                 <w:rFonts w:ascii="Times New Roman" w:hAnsi="Times New Roman"/>
                 <w:sz w:val="22"/>
               </w:rPr>
-              <w:t>832.576 baris, 70 UMKM, 400 hari, kalender SKB</w:t>
+              <w:t>5.827.863 baris, 70 UMKM, 400 hari, kalender SKB</w:t>
             </w:r>
           </w:p>
         </w:tc>
@@ -174,6 +192,9 @@
             <w:tcW w:type="dxa" w:w="2268"/>
           </w:tcPr>
           <w:p>
+            <w:pPr>
+              <w:jc w:val="left"/>
+            </w:pPr>
             <w:r/>
             <w:r>
               <w:rPr>
@@ -189,6 +210,9 @@
             <w:tcW w:type="dxa" w:w="6236"/>
           </w:tcPr>
           <w:p>
+            <w:pPr>
+              <w:jc w:val="left"/>
+            </w:pPr>
             <w:r/>
             <w:r>
               <w:rPr>
@@ -206,6 +230,9 @@
             <w:tcW w:type="dxa" w:w="2268"/>
           </w:tcPr>
           <w:p>
+            <w:pPr>
+              <w:jc w:val="left"/>
+            </w:pPr>
             <w:r/>
             <w:r>
               <w:rPr>
@@ -221,6 +248,9 @@
             <w:tcW w:type="dxa" w:w="6236"/>
           </w:tcPr>
           <w:p>
+            <w:pPr>
+              <w:jc w:val="left"/>
+            </w:pPr>
             <w:r/>
             <w:r>
               <w:rPr>
@@ -238,6 +268,9 @@
             <w:tcW w:type="dxa" w:w="2268"/>
           </w:tcPr>
           <w:p>
+            <w:pPr>
+              <w:jc w:val="left"/>
+            </w:pPr>
             <w:r/>
             <w:r>
               <w:rPr>
@@ -253,13 +286,16 @@
             <w:tcW w:type="dxa" w:w="6236"/>
           </w:tcPr>
           <w:p>
+            <w:pPr>
+              <w:jc w:val="left"/>
+            </w:pPr>
             <w:r/>
             <w:r>
               <w:rPr>
                 <w:rFonts w:ascii="Times New Roman" w:hAnsi="Times New Roman"/>
                 <w:sz w:val="22"/>
               </w:rPr>
-              <w:t>Chronos-2 (Apache-2.0), 6 metode dibandingkan</w:t>
+              <w:t>ETS (Holt-Winters) untuk produksi; SARIMAX dan VAR untuk omset; Chronos-2 sebagai pembanding. MAPE pekanan unit, barang lolos saringan: 15,4% (baik). MAPE pekanan omset terbaik: 8,8% (SARIMAX).</w:t>
             </w:r>
           </w:p>
         </w:tc>
@@ -270,6 +306,9 @@
             <w:tcW w:type="dxa" w:w="2268"/>
           </w:tcPr>
           <w:p>
+            <w:pPr>
+              <w:jc w:val="left"/>
+            </w:pPr>
             <w:r/>
             <w:r>
               <w:rPr>
@@ -285,13 +324,16 @@
             <w:tcW w:type="dxa" w:w="6236"/>
           </w:tcPr>
           <w:p>
+            <w:pPr>
+              <w:jc w:val="left"/>
+            </w:pPr>
             <w:r/>
             <w:r>
               <w:rPr>
                 <w:rFonts w:ascii="Times New Roman" w:hAnsi="Times New Roman"/>
                 <w:sz w:val="22"/>
               </w:rPr>
-              <w:t>Contextual bandit: BART + Thompson, simulasi regret</w:t>
+              <w:t>Beta-Bernoulli + Thompson + fuzzy: saran distributor dan tiga segmen distributor. Simulasi regret 400 hari, 9.328 keputusan, 11 varian di tiga sumbu.</w:t>
             </w:r>
           </w:p>
         </w:tc>
@@ -302,13 +344,16 @@
             <w:tcW w:type="dxa" w:w="2268"/>
           </w:tcPr>
           <w:p>
+            <w:pPr>
+              <w:jc w:val="left"/>
+            </w:pPr>
             <w:r/>
             <w:r>
               <w:rPr>
                 <w:rFonts w:ascii="Times New Roman" w:hAnsi="Times New Roman"/>
                 <w:sz w:val="22"/>
               </w:rPr>
-              <w:t>G. Mesin 3</w:t>
+              <w:t>G. Profil pelanggan</w:t>
             </w:r>
           </w:p>
         </w:tc>
@@ -317,13 +362,16 @@
             <w:tcW w:type="dxa" w:w="6236"/>
           </w:tcPr>
           <w:p>
+            <w:pPr>
+              <w:jc w:val="left"/>
+            </w:pPr>
             <w:r/>
             <w:r>
               <w:rPr>
                 <w:rFonts w:ascii="Times New Roman" w:hAnsi="Times New Roman"/>
                 <w:sz w:val="22"/>
               </w:rPr>
-              <w:t>K-Prototypes, segmentasi per distributor</w:t>
+              <w:t>K-Prototypes, pengelompokan pelanggan per distributor (fitur pendukung)</w:t>
             </w:r>
           </w:p>
         </w:tc>
@@ -334,6 +382,9 @@
             <w:tcW w:type="dxa" w:w="2268"/>
           </w:tcPr>
           <w:p>
+            <w:pPr>
+              <w:jc w:val="left"/>
+            </w:pPr>
             <w:r/>
             <w:r>
               <w:rPr>
@@ -349,13 +400,494 @@
             <w:tcW w:type="dxa" w:w="6236"/>
           </w:tcPr>
           <w:p>
+            <w:pPr>
+              <w:jc w:val="left"/>
+            </w:pPr>
             <w:r/>
             <w:r>
               <w:rPr>
                 <w:rFonts w:ascii="Times New Roman" w:hAnsi="Times New Roman"/>
                 <w:sz w:val="22"/>
               </w:rPr>
-              <w:t>37 uji, semuanya lulus</w:t>
+              <w:t>83 uji, semuanya lulus</w:t>
+            </w:r>
+          </w:p>
+        </w:tc>
+      </w:tr>
+    </w:tbl>
+    <w:p/>
+    <w:p>
+      <w:pPr>
+        <w:jc w:val="both"/>
+      </w:pPr>
+      <w:r>
+        <w:rPr>
+          <w:rFonts w:ascii="Times New Roman" w:hAnsi="Times New Roman"/>
+          <w:b/>
+          <w:sz w:val="24"/>
+        </w:rPr>
+        <w:t>Catatan dosen dan tanggapannya</w:t>
+      </w:r>
+    </w:p>
+    <w:tbl>
+      <w:tblPr>
+        <w:tblStyle w:val="LightGrid-Accent1"/>
+        <w:tblW w:type="auto" w:w="0"/>
+        <w:jc w:val="center"/>
+        <w:tblLook w:firstColumn="1" w:firstRow="1" w:lastColumn="0" w:lastRow="0" w:noHBand="0" w:noVBand="1" w:val="04A0"/>
+      </w:tblPr>
+      <w:tblGrid>
+        <w:gridCol w:w="3041"/>
+        <w:gridCol w:w="3041"/>
+        <w:gridCol w:w="3041"/>
+      </w:tblGrid>
+      <w:tr>
+        <w:tc>
+          <w:tcPr>
+            <w:tcW w:type="dxa" w:w="3061"/>
+          </w:tcPr>
+          <w:p>
+            <w:pPr>
+              <w:jc w:val="left"/>
+            </w:pPr>
+            <w:r/>
+            <w:r>
+              <w:rPr>
+                <w:rFonts w:ascii="Times New Roman" w:hAnsi="Times New Roman"/>
+                <w:b/>
+                <w:sz w:val="22"/>
+              </w:rPr>
+              <w:t>Catatan</w:t>
+            </w:r>
+          </w:p>
+        </w:tc>
+        <w:tc>
+          <w:tcPr>
+            <w:tcW w:type="dxa" w:w="4195"/>
+          </w:tcPr>
+          <w:p>
+            <w:pPr>
+              <w:jc w:val="left"/>
+            </w:pPr>
+            <w:r/>
+            <w:r>
+              <w:rPr>
+                <w:rFonts w:ascii="Times New Roman" w:hAnsi="Times New Roman"/>
+                <w:b/>
+                <w:sz w:val="22"/>
+              </w:rPr>
+              <w:t>Tanggapan</w:t>
+            </w:r>
+          </w:p>
+        </w:tc>
+        <w:tc>
+          <w:tcPr>
+            <w:tcW w:type="dxa" w:w="1247"/>
+          </w:tcPr>
+          <w:p>
+            <w:pPr>
+              <w:jc w:val="left"/>
+            </w:pPr>
+            <w:r/>
+            <w:r>
+              <w:rPr>
+                <w:rFonts w:ascii="Times New Roman" w:hAnsi="Times New Roman"/>
+                <w:b/>
+                <w:sz w:val="22"/>
+              </w:rPr>
+              <w:t>Bagian</w:t>
+            </w:r>
+          </w:p>
+        </w:tc>
+      </w:tr>
+      <w:tr>
+        <w:tc>
+          <w:tcPr>
+            <w:tcW w:type="dxa" w:w="3061"/>
+          </w:tcPr>
+          <w:p>
+            <w:pPr>
+              <w:jc w:val="left"/>
+            </w:pPr>
+            <w:r/>
+            <w:r>
+              <w:rPr>
+                <w:rFonts w:ascii="Times New Roman" w:hAnsi="Times New Roman"/>
+                <w:sz w:val="22"/>
+              </w:rPr>
+              <w:t>Ramal omset, univariat atau multivariat (dengan jumlah barang dan jumlah pelanggan)</w:t>
+            </w:r>
+          </w:p>
+        </w:tc>
+        <w:tc>
+          <w:tcPr>
+            <w:tcW w:type="dxa" w:w="4195"/>
+          </w:tcPr>
+          <w:p>
+            <w:pPr>
+              <w:jc w:val="left"/>
+            </w:pPr>
+            <w:r/>
+            <w:r>
+              <w:rPr>
+                <w:rFonts w:ascii="Times New Roman" w:hAnsi="Times New Roman"/>
+                <w:sz w:val="22"/>
+              </w:rPr>
+              <w:t>ETS dan SARIMAX (univariat + kalender); VAR meramal omset, jumlah barang, dan jumlah nota bersama</w:t>
+            </w:r>
+          </w:p>
+        </w:tc>
+        <w:tc>
+          <w:tcPr>
+            <w:tcW w:type="dxa" w:w="1247"/>
+          </w:tcPr>
+          <w:p>
+            <w:pPr>
+              <w:jc w:val="left"/>
+            </w:pPr>
+            <w:r/>
+            <w:r>
+              <w:rPr>
+                <w:rFonts w:ascii="Times New Roman" w:hAnsi="Times New Roman"/>
+                <w:sz w:val="22"/>
+              </w:rPr>
+              <w:t>6.6</w:t>
+            </w:r>
+          </w:p>
+        </w:tc>
+      </w:tr>
+      <w:tr>
+        <w:tc>
+          <w:tcPr>
+            <w:tcW w:type="dxa" w:w="3061"/>
+          </w:tcPr>
+          <w:p>
+            <w:pPr>
+              <w:jc w:val="left"/>
+            </w:pPr>
+            <w:r/>
+            <w:r>
+              <w:rPr>
+                <w:rFonts w:ascii="Times New Roman" w:hAnsi="Times New Roman"/>
+                <w:sz w:val="22"/>
+              </w:rPr>
+              <w:t>MAPE ≤ 5%, bukan MSE</w:t>
+            </w:r>
+          </w:p>
+        </w:tc>
+        <w:tc>
+          <w:tcPr>
+            <w:tcW w:type="dxa" w:w="4195"/>
+          </w:tcPr>
+          <w:p>
+            <w:pPr>
+              <w:jc w:val="left"/>
+            </w:pPr>
+            <w:r/>
+            <w:r>
+              <w:rPr>
+                <w:rFonts w:ascii="Times New Roman" w:hAnsi="Times New Roman"/>
+                <w:sz w:val="22"/>
+              </w:rPr>
+              <w:t>MAPE pekanan di tiga tingkat, dibaca dengan skala Lewis. 5% belum tercapai; alasannya dijelaskan</w:t>
+            </w:r>
+          </w:p>
+        </w:tc>
+        <w:tc>
+          <w:tcPr>
+            <w:tcW w:type="dxa" w:w="1247"/>
+          </w:tcPr>
+          <w:p>
+            <w:pPr>
+              <w:jc w:val="left"/>
+            </w:pPr>
+            <w:r/>
+            <w:r>
+              <w:rPr>
+                <w:rFonts w:ascii="Times New Roman" w:hAnsi="Times New Roman"/>
+                <w:sz w:val="22"/>
+              </w:rPr>
+              <w:t>6.4, 6.7</w:t>
+            </w:r>
+          </w:p>
+        </w:tc>
+      </w:tr>
+      <w:tr>
+        <w:tc>
+          <w:tcPr>
+            <w:tcW w:type="dxa" w:w="3061"/>
+          </w:tcPr>
+          <w:p>
+            <w:pPr>
+              <w:jc w:val="left"/>
+            </w:pPr>
+            <w:r/>
+            <w:r>
+              <w:rPr>
+                <w:rFonts w:ascii="Times New Roman" w:hAnsi="Times New Roman"/>
+                <w:sz w:val="22"/>
+              </w:rPr>
+              <w:t>Pencilan dengan Mahalanobis, bukan boxplot</w:t>
+            </w:r>
+          </w:p>
+        </w:tc>
+        <w:tc>
+          <w:tcPr>
+            <w:tcW w:type="dxa" w:w="4195"/>
+          </w:tcPr>
+          <w:p>
+            <w:pPr>
+              <w:jc w:val="left"/>
+            </w:pPr>
+            <w:r/>
+            <w:r>
+              <w:rPr>
+                <w:rFonts w:ascii="Times New Roman" w:hAnsi="Times New Roman"/>
+                <w:sz w:val="22"/>
+              </w:rPr>
+              <w:t>Mahalanobis dengan MCD; pencilan ditandai, tidak dibuang; Lebaran bukan pencilan</w:t>
+            </w:r>
+          </w:p>
+        </w:tc>
+        <w:tc>
+          <w:tcPr>
+            <w:tcW w:type="dxa" w:w="1247"/>
+          </w:tcPr>
+          <w:p>
+            <w:pPr>
+              <w:jc w:val="left"/>
+            </w:pPr>
+            <w:r/>
+            <w:r>
+              <w:rPr>
+                <w:rFonts w:ascii="Times New Roman" w:hAnsi="Times New Roman"/>
+                <w:sz w:val="22"/>
+              </w:rPr>
+              <w:t>6.3</w:t>
+            </w:r>
+          </w:p>
+        </w:tc>
+      </w:tr>
+      <w:tr>
+        <w:tc>
+          <w:tcPr>
+            <w:tcW w:type="dxa" w:w="3061"/>
+          </w:tcPr>
+          <w:p>
+            <w:pPr>
+              <w:jc w:val="left"/>
+            </w:pPr>
+            <w:r/>
+            <w:r>
+              <w:rPr>
+                <w:rFonts w:ascii="Times New Roman" w:hAnsi="Times New Roman"/>
+                <w:sz w:val="22"/>
+              </w:rPr>
+              <w:t>Jangan memakai metode yang tidak dipahami tim</w:t>
+            </w:r>
+          </w:p>
+        </w:tc>
+        <w:tc>
+          <w:tcPr>
+            <w:tcW w:type="dxa" w:w="4195"/>
+          </w:tcPr>
+          <w:p>
+            <w:pPr>
+              <w:jc w:val="left"/>
+            </w:pPr>
+            <w:r/>
+            <w:r>
+              <w:rPr>
+                <w:rFonts w:ascii="Times New Roman" w:hAnsi="Times New Roman"/>
+                <w:sz w:val="22"/>
+              </w:rPr>
+              <w:t>Model utama ETS, SARIMAX, VAR, Beta-Bernoulli, fuzzy. Chronos-2 dan BART hanya pembanding</w:t>
+            </w:r>
+          </w:p>
+        </w:tc>
+        <w:tc>
+          <w:tcPr>
+            <w:tcW w:type="dxa" w:w="1247"/>
+          </w:tcPr>
+          <w:p>
+            <w:pPr>
+              <w:jc w:val="left"/>
+            </w:pPr>
+            <w:r/>
+            <w:r>
+              <w:rPr>
+                <w:rFonts w:ascii="Times New Roman" w:hAnsi="Times New Roman"/>
+                <w:sz w:val="22"/>
+              </w:rPr>
+              <w:t>6.9, 7.5</w:t>
+            </w:r>
+          </w:p>
+        </w:tc>
+      </w:tr>
+      <w:tr>
+        <w:tc>
+          <w:tcPr>
+            <w:tcW w:type="dxa" w:w="3061"/>
+          </w:tcPr>
+          <w:p>
+            <w:pPr>
+              <w:jc w:val="left"/>
+            </w:pPr>
+            <w:r/>
+            <w:r>
+              <w:rPr>
+                <w:rFonts w:ascii="Times New Roman" w:hAnsi="Times New Roman"/>
+                <w:sz w:val="22"/>
+              </w:rPr>
+              <w:t>Hanya 10 barang teratas yang diramal</w:t>
+            </w:r>
+          </w:p>
+        </w:tc>
+        <w:tc>
+          <w:tcPr>
+            <w:tcW w:type="dxa" w:w="4195"/>
+          </w:tcPr>
+          <w:p>
+            <w:pPr>
+              <w:jc w:val="left"/>
+            </w:pPr>
+            <w:r/>
+            <w:r>
+              <w:rPr>
+                <w:rFonts w:ascii="Times New Roman" w:hAnsi="Times New Roman"/>
+                <w:sz w:val="22"/>
+              </w:rPr>
+              <w:t>ABC 10 teratas per katalog UMKM menurut nilai, ditambah Syntetos–Boylan dan uji musiman</w:t>
+            </w:r>
+          </w:p>
+        </w:tc>
+        <w:tc>
+          <w:tcPr>
+            <w:tcW w:type="dxa" w:w="1247"/>
+          </w:tcPr>
+          <w:p>
+            <w:pPr>
+              <w:jc w:val="left"/>
+            </w:pPr>
+            <w:r/>
+            <w:r>
+              <w:rPr>
+                <w:rFonts w:ascii="Times New Roman" w:hAnsi="Times New Roman"/>
+                <w:sz w:val="22"/>
+              </w:rPr>
+              <w:t>6.2</w:t>
+            </w:r>
+          </w:p>
+        </w:tc>
+      </w:tr>
+      <w:tr>
+        <w:tc>
+          <w:tcPr>
+            <w:tcW w:type="dxa" w:w="3061"/>
+          </w:tcPr>
+          <w:p>
+            <w:pPr>
+              <w:jc w:val="left"/>
+            </w:pPr>
+            <w:r/>
+            <w:r>
+              <w:rPr>
+                <w:rFonts w:ascii="Times New Roman" w:hAnsi="Times New Roman"/>
+                <w:sz w:val="22"/>
+              </w:rPr>
+              <w:t>Segmentasi distributor dengan Bayesian, pohon keputusan, atau fuzzy</w:t>
+            </w:r>
+          </w:p>
+        </w:tc>
+        <w:tc>
+          <w:tcPr>
+            <w:tcW w:type="dxa" w:w="4195"/>
+          </w:tcPr>
+          <w:p>
+            <w:pPr>
+              <w:jc w:val="left"/>
+            </w:pPr>
+            <w:r/>
+            <w:r>
+              <w:rPr>
+                <w:rFonts w:ascii="Times New Roman" w:hAnsi="Times New Roman"/>
+                <w:sz w:val="22"/>
+              </w:rPr>
+              <w:t>Beta-Bernoulli (Bayesian) + fuzzy Sugeno, menghasilkan tiga segmen</w:t>
+            </w:r>
+          </w:p>
+        </w:tc>
+        <w:tc>
+          <w:tcPr>
+            <w:tcW w:type="dxa" w:w="1247"/>
+          </w:tcPr>
+          <w:p>
+            <w:pPr>
+              <w:jc w:val="left"/>
+            </w:pPr>
+            <w:r/>
+            <w:r>
+              <w:rPr>
+                <w:rFonts w:ascii="Times New Roman" w:hAnsi="Times New Roman"/>
+                <w:sz w:val="22"/>
+              </w:rPr>
+              <w:t>7</w:t>
+            </w:r>
+          </w:p>
+        </w:tc>
+      </w:tr>
+      <w:tr>
+        <w:tc>
+          <w:tcPr>
+            <w:tcW w:type="dxa" w:w="3061"/>
+          </w:tcPr>
+          <w:p>
+            <w:pPr>
+              <w:jc w:val="left"/>
+            </w:pPr>
+            <w:r/>
+            <w:r>
+              <w:rPr>
+                <w:rFonts w:ascii="Times New Roman" w:hAnsi="Times New Roman"/>
+                <w:sz w:val="22"/>
+              </w:rPr>
+              <w:t>Laju pemakaian &gt; 30% per pekan, dan musiman</w:t>
+            </w:r>
+          </w:p>
+        </w:tc>
+        <w:tc>
+          <w:tcPr>
+            <w:tcW w:type="dxa" w:w="4195"/>
+          </w:tcPr>
+          <w:p>
+            <w:pPr>
+              <w:jc w:val="left"/>
+            </w:pPr>
+            <w:r/>
+            <w:r>
+              <w:rPr>
+                <w:rFonts w:ascii="Times New Roman" w:hAnsi="Times New Roman"/>
+                <w:sz w:val="22"/>
+              </w:rPr>
+              <w:t>Musiman diuji dengan STL. Ambang 30% tidak dipakai menyaring karena mengukur kebijakan restock; alasannya dijelaskan</w:t>
+            </w:r>
+          </w:p>
+        </w:tc>
+        <w:tc>
+          <w:tcPr>
+            <w:tcW w:type="dxa" w:w="1247"/>
+          </w:tcPr>
+          <w:p>
+            <w:pPr>
+              <w:jc w:val="left"/>
+            </w:pPr>
+            <w:r/>
+            <w:r>
+              <w:rPr>
+                <w:rFonts w:ascii="Times New Roman" w:hAnsi="Times New Roman"/>
+                <w:sz w:val="22"/>
+              </w:rPr>
+              <w:t>6.2</w:t>
             </w:r>
           </w:p>
         </w:tc>
@@ -418,6 +950,9 @@
             <w:tcW w:type="dxa" w:w="2835"/>
           </w:tcPr>
           <w:p>
+            <w:pPr>
+              <w:jc w:val="left"/>
+            </w:pPr>
             <w:r/>
             <w:r>
               <w:rPr>
@@ -434,6 +969,9 @@
             <w:tcW w:type="dxa" w:w="4535"/>
           </w:tcPr>
           <w:p>
+            <w:pPr>
+              <w:jc w:val="left"/>
+            </w:pPr>
             <w:r/>
             <w:r>
               <w:rPr>
@@ -452,6 +990,9 @@
             <w:tcW w:type="dxa" w:w="2835"/>
           </w:tcPr>
           <w:p>
+            <w:pPr>
+              <w:jc w:val="left"/>
+            </w:pPr>
             <w:r/>
             <w:r>
               <w:rPr>
@@ -467,6 +1008,9 @@
             <w:tcW w:type="dxa" w:w="4535"/>
           </w:tcPr>
           <w:p>
+            <w:pPr>
+              <w:jc w:val="left"/>
+            </w:pPr>
             <w:r/>
             <w:r>
               <w:rPr>
@@ -484,6 +1028,9 @@
             <w:tcW w:type="dxa" w:w="2835"/>
           </w:tcPr>
           <w:p>
+            <w:pPr>
+              <w:jc w:val="left"/>
+            </w:pPr>
             <w:r/>
             <w:r>
               <w:rPr>
@@ -499,6 +1046,9 @@
             <w:tcW w:type="dxa" w:w="4535"/>
           </w:tcPr>
           <w:p>
+            <w:pPr>
+              <w:jc w:val="left"/>
+            </w:pPr>
             <w:r/>
             <w:r>
               <w:rPr>
@@ -516,6 +1066,9 @@
             <w:tcW w:type="dxa" w:w="2835"/>
           </w:tcPr>
           <w:p>
+            <w:pPr>
+              <w:jc w:val="left"/>
+            </w:pPr>
             <w:r/>
             <w:r>
               <w:rPr>
@@ -531,6 +1084,9 @@
             <w:tcW w:type="dxa" w:w="4535"/>
           </w:tcPr>
           <w:p>
+            <w:pPr>
+              <w:jc w:val="left"/>
+            </w:pPr>
             <w:r/>
             <w:r>
               <w:rPr>
@@ -548,6 +1104,9 @@
             <w:tcW w:type="dxa" w:w="2835"/>
           </w:tcPr>
           <w:p>
+            <w:pPr>
+              <w:jc w:val="left"/>
+            </w:pPr>
             <w:r/>
             <w:r>
               <w:rPr>
@@ -563,6 +1122,9 @@
             <w:tcW w:type="dxa" w:w="4535"/>
           </w:tcPr>
           <w:p>
+            <w:pPr>
+              <w:jc w:val="left"/>
+            </w:pPr>
             <w:r/>
             <w:r>
               <w:rPr>
@@ -580,6 +1142,9 @@
             <w:tcW w:type="dxa" w:w="2835"/>
           </w:tcPr>
           <w:p>
+            <w:pPr>
+              <w:jc w:val="left"/>
+            </w:pPr>
             <w:r/>
             <w:r>
               <w:rPr>
@@ -595,6 +1160,9 @@
             <w:tcW w:type="dxa" w:w="4535"/>
           </w:tcPr>
           <w:p>
+            <w:pPr>
+              <w:jc w:val="left"/>
+            </w:pPr>
             <w:r/>
             <w:r>
               <w:rPr>
@@ -724,6 +1292,9 @@
             <w:tcW w:type="dxa" w:w="2835"/>
           </w:tcPr>
           <w:p>
+            <w:pPr>
+              <w:jc w:val="left"/>
+            </w:pPr>
             <w:r/>
             <w:r>
               <w:rPr>
@@ -740,6 +1311,9 @@
             <w:tcW w:type="dxa" w:w="4535"/>
           </w:tcPr>
           <w:p>
+            <w:pPr>
+              <w:jc w:val="left"/>
+            </w:pPr>
             <w:r/>
             <w:r>
               <w:rPr>
@@ -758,6 +1332,9 @@
             <w:tcW w:type="dxa" w:w="2835"/>
           </w:tcPr>
           <w:p>
+            <w:pPr>
+              <w:jc w:val="left"/>
+            </w:pPr>
             <w:r/>
             <w:r>
               <w:rPr>
@@ -773,13 +1350,16 @@
             <w:tcW w:type="dxa" w:w="4535"/>
           </w:tcPr>
           <w:p>
+            <w:pPr>
+              <w:jc w:val="left"/>
+            </w:pPr>
             <w:r/>
             <w:r>
               <w:rPr>
                 <w:rFonts w:ascii="Times New Roman" w:hAnsi="Times New Roman"/>
                 <w:sz w:val="22"/>
               </w:rPr>
-              <w:t>832.576</w:t>
+              <w:t>5.827.863</w:t>
             </w:r>
           </w:p>
         </w:tc>
@@ -790,6 +1370,9 @@
             <w:tcW w:type="dxa" w:w="2835"/>
           </w:tcPr>
           <w:p>
+            <w:pPr>
+              <w:jc w:val="left"/>
+            </w:pPr>
             <w:r/>
             <w:r>
               <w:rPr>
@@ -805,6 +1388,9 @@
             <w:tcW w:type="dxa" w:w="4535"/>
           </w:tcPr>
           <w:p>
+            <w:pPr>
+              <w:jc w:val="left"/>
+            </w:pPr>
             <w:r/>
             <w:r>
               <w:rPr>
@@ -822,6 +1408,9 @@
             <w:tcW w:type="dxa" w:w="2835"/>
           </w:tcPr>
           <w:p>
+            <w:pPr>
+              <w:jc w:val="left"/>
+            </w:pPr>
             <w:r/>
             <w:r>
               <w:rPr>
@@ -837,6 +1426,9 @@
             <w:tcW w:type="dxa" w:w="4535"/>
           </w:tcPr>
           <w:p>
+            <w:pPr>
+              <w:jc w:val="left"/>
+            </w:pPr>
             <w:r/>
             <w:r>
               <w:rPr>
@@ -854,6 +1446,9 @@
             <w:tcW w:type="dxa" w:w="2835"/>
           </w:tcPr>
           <w:p>
+            <w:pPr>
+              <w:jc w:val="left"/>
+            </w:pPr>
             <w:r/>
             <w:r>
               <w:rPr>
@@ -869,6 +1464,9 @@
             <w:tcW w:type="dxa" w:w="4535"/>
           </w:tcPr>
           <w:p>
+            <w:pPr>
+              <w:jc w:val="left"/>
+            </w:pPr>
             <w:r/>
             <w:r>
               <w:rPr>
@@ -886,6 +1484,9 @@
             <w:tcW w:type="dxa" w:w="2835"/>
           </w:tcPr>
           <w:p>
+            <w:pPr>
+              <w:jc w:val="left"/>
+            </w:pPr>
             <w:r/>
             <w:r>
               <w:rPr>
@@ -901,6 +1502,9 @@
             <w:tcW w:type="dxa" w:w="4535"/>
           </w:tcPr>
           <w:p>
+            <w:pPr>
+              <w:jc w:val="left"/>
+            </w:pPr>
             <w:r/>
             <w:r>
               <w:rPr>
@@ -1292,7 +1896,7 @@
         <w:pStyle w:val="Heading1"/>
       </w:pPr>
       <w:r>
-        <w:t>E. Mesin 1 — perkiraan permintaan — bagian 6</w:t>
+        <w:t>E. Mesin 1 — perkiraan permintaan dan omset — bagian 6</w:t>
       </w:r>
     </w:p>
     <w:p>
@@ -1318,7 +1922,7 @@
           <w:b w:val="0"/>
           <w:sz w:val="24"/>
         </w:rPr>
-        <w:t>Berapa banyak bahan yang akan terpakai, per barang per hari, 30 hari ke depan, dalam bentuk p10 / p50 / p90. Batas aman diambil dari p90 selama lama pengiriman, bukan dari p50 — p50 berarti separuh waktu warung kehabisan.</w:t>
+        <w:t>Dua hal: unit tiap barang pekan depan (untuk batas aman, dari p90) dan omset tiap UMKM pekan depan (untuk gambaran bisnis pemilik).</w:t>
       </w:r>
     </w:p>
     <w:p>
@@ -1331,7 +1935,7 @@
           <w:b/>
           <w:sz w:val="24"/>
         </w:rPr>
-        <w:t>Kenapa Chronos-2 dan bukan MOIRAI.</w:t>
+        <w:t>Barang mana yang diramal.</w:t>
       </w:r>
     </w:p>
     <w:p>
@@ -1344,7 +1948,46 @@
           <w:b w:val="0"/>
           <w:sz w:val="24"/>
         </w:rPr>
-        <w:t>Keduanya bisa diunduh tanpa akun dan mutunya setara. Bedanya lisensi bobot: MOIRAI CC-BY-NC-4.0 (non-komersial), Chronos-2 Apache-2.0. Kalau Warungku dijual, bobot MOIRAI tidak boleh ikut — dan seluruh angka batas aman berasal dari situ.</w:t>
+        <w:t>10 teratas per katalog menurut nilai (ABC), polanya halus (Syntetos–Boylan), atau musimannya kuat (STL). Barang lain tetap mendapat batas aman dari aturan sederhana. Hasilnya 632 dari 890 barang diramal dengan model.</w:t>
+      </w:r>
+    </w:p>
+    <w:p>
+      <w:pPr>
+        <w:jc w:val="both"/>
+      </w:pPr>
+      <w:r>
+        <w:rPr>
+          <w:rFonts w:ascii="Times New Roman" w:hAnsi="Times New Roman"/>
+          <w:b/>
+          <w:sz w:val="24"/>
+        </w:rPr>
+        <w:t>Pencilan.</w:t>
+      </w:r>
+    </w:p>
+    <w:p>
+      <w:pPr>
+        <w:jc w:val="both"/>
+      </w:pPr>
+      <w:r>
+        <w:rPr>
+          <w:rFonts w:ascii="Times New Roman" w:hAnsi="Times New Roman"/>
+          <w:b w:val="0"/>
+          <w:sz w:val="24"/>
+        </w:rPr>
+        <w:t>Jarak Mahalanobis dengan MCD atas log omset, jumlah barang, dan jumlah nota; batas chi-kuadrat 0,999. Ditandai, tidak dibuang. Libur, Ramadan, dan Lebaran tidak pernah ditandai.</w:t>
+      </w:r>
+    </w:p>
+    <w:p>
+      <w:pPr>
+        <w:jc w:val="both"/>
+      </w:pPr>
+      <w:r>
+        <w:rPr>
+          <w:rFonts w:ascii="Times New Roman" w:hAnsi="Times New Roman"/>
+          <w:b/>
+          <w:sz w:val="24"/>
+        </w:rPr>
+        <w:t>Hasil: MAPE pekanan (jumlah tujuh hari, satu siklus restock).</w:t>
       </w:r>
     </w:p>
     <w:tbl>
@@ -1355,18 +1998,20 @@
         <w:tblLook w:firstColumn="1" w:firstRow="1" w:lastColumn="0" w:lastRow="0" w:noHBand="0" w:noVBand="1" w:val="04A0"/>
       </w:tblPr>
       <w:tblGrid>
-        <w:gridCol w:w="1824"/>
-        <w:gridCol w:w="1824"/>
-        <w:gridCol w:w="1824"/>
-        <w:gridCol w:w="1824"/>
-        <w:gridCol w:w="1824"/>
+        <w:gridCol w:w="2280"/>
+        <w:gridCol w:w="2280"/>
+        <w:gridCol w:w="2280"/>
+        <w:gridCol w:w="2280"/>
       </w:tblGrid>
       <w:tr>
         <w:tc>
           <w:tcPr>
-            <w:tcW w:type="dxa" w:w="2551"/>
+            <w:tcW w:type="dxa" w:w="2835"/>
           </w:tcPr>
           <w:p>
+            <w:pPr>
+              <w:jc w:val="left"/>
+            </w:pPr>
             <w:r/>
             <w:r>
               <w:rPr>
@@ -1374,7 +2019,45 @@
                 <w:b/>
                 <w:sz w:val="22"/>
               </w:rPr>
-              <w:t>Metode</w:t>
+              <w:t>Unit per barang</w:t>
+            </w:r>
+          </w:p>
+        </w:tc>
+        <w:tc>
+          <w:tcPr>
+            <w:tcW w:type="dxa" w:w="2268"/>
+          </w:tcPr>
+          <w:p>
+            <w:pPr>
+              <w:jc w:val="left"/>
+            </w:pPr>
+            <w:r/>
+            <w:r>
+              <w:rPr>
+                <w:rFonts w:ascii="Times New Roman" w:hAnsi="Times New Roman"/>
+                <w:b/>
+                <w:sz w:val="22"/>
+              </w:rPr>
+              <w:t>Barang lolos</w:t>
+            </w:r>
+          </w:p>
+        </w:tc>
+        <w:tc>
+          <w:tcPr>
+            <w:tcW w:type="dxa" w:w="1701"/>
+          </w:tcPr>
+          <w:p>
+            <w:pPr>
+              <w:jc w:val="left"/>
+            </w:pPr>
+            <w:r/>
+            <w:r>
+              <w:rPr>
+                <w:rFonts w:ascii="Times New Roman" w:hAnsi="Times New Roman"/>
+                <w:b/>
+                <w:sz w:val="22"/>
+              </w:rPr>
+              <w:t>Semua barang</w:t>
             </w:r>
           </w:p>
         </w:tc>
@@ -1383,6 +2066,9 @@
             <w:tcW w:type="dxa" w:w="1417"/>
           </w:tcPr>
           <w:p>
+            <w:pPr>
+              <w:jc w:val="left"/>
+            </w:pPr>
             <w:r/>
             <w:r>
               <w:rPr>
@@ -1390,7 +2076,63 @@
                 <w:b/>
                 <w:sz w:val="22"/>
               </w:rPr>
-              <w:t>MASE</w:t>
+              <w:t>Harian</w:t>
+            </w:r>
+          </w:p>
+        </w:tc>
+      </w:tr>
+      <w:tr>
+        <w:tc>
+          <w:tcPr>
+            <w:tcW w:type="dxa" w:w="2835"/>
+          </w:tcPr>
+          <w:p>
+            <w:pPr>
+              <w:jc w:val="left"/>
+            </w:pPr>
+            <w:r/>
+            <w:r>
+              <w:rPr>
+                <w:rFonts w:ascii="Times New Roman" w:hAnsi="Times New Roman"/>
+                <w:sz w:val="22"/>
+              </w:rPr>
+              <w:t>Kuantil hari-pekan</w:t>
+            </w:r>
+          </w:p>
+        </w:tc>
+        <w:tc>
+          <w:tcPr>
+            <w:tcW w:type="dxa" w:w="2268"/>
+          </w:tcPr>
+          <w:p>
+            <w:pPr>
+              <w:jc w:val="left"/>
+            </w:pPr>
+            <w:r/>
+            <w:r>
+              <w:rPr>
+                <w:rFonts w:ascii="Times New Roman" w:hAnsi="Times New Roman"/>
+                <w:sz w:val="22"/>
+              </w:rPr>
+              <w:t>14,9% (baik)</w:t>
+            </w:r>
+          </w:p>
+        </w:tc>
+        <w:tc>
+          <w:tcPr>
+            <w:tcW w:type="dxa" w:w="1701"/>
+          </w:tcPr>
+          <w:p>
+            <w:pPr>
+              <w:jc w:val="left"/>
+            </w:pPr>
+            <w:r/>
+            <w:r>
+              <w:rPr>
+                <w:rFonts w:ascii="Times New Roman" w:hAnsi="Times New Roman"/>
+                <w:sz w:val="22"/>
+              </w:rPr>
+              <w:t>23,0%</w:t>
             </w:r>
           </w:p>
         </w:tc>
@@ -1399,14 +2141,72 @@
             <w:tcW w:type="dxa" w:w="1417"/>
           </w:tcPr>
           <w:p>
+            <w:pPr>
+              <w:jc w:val="left"/>
+            </w:pPr>
             <w:r/>
             <w:r>
               <w:rPr>
                 <w:rFonts w:ascii="Times New Roman" w:hAnsi="Times New Roman"/>
-                <w:b/>
                 <w:sz w:val="22"/>
               </w:rPr>
-              <w:t>WQL</w:t>
+              <w:t>43,9%</w:t>
+            </w:r>
+          </w:p>
+        </w:tc>
+      </w:tr>
+      <w:tr>
+        <w:tc>
+          <w:tcPr>
+            <w:tcW w:type="dxa" w:w="2835"/>
+          </w:tcPr>
+          <w:p>
+            <w:pPr>
+              <w:jc w:val="left"/>
+            </w:pPr>
+            <w:r/>
+            <w:r>
+              <w:rPr>
+                <w:rFonts w:ascii="Times New Roman" w:hAnsi="Times New Roman"/>
+                <w:sz w:val="22"/>
+              </w:rPr>
+              <w:t>ETS / Holt-Winters</w:t>
+            </w:r>
+          </w:p>
+        </w:tc>
+        <w:tc>
+          <w:tcPr>
+            <w:tcW w:type="dxa" w:w="2268"/>
+          </w:tcPr>
+          <w:p>
+            <w:pPr>
+              <w:jc w:val="left"/>
+            </w:pPr>
+            <w:r/>
+            <w:r>
+              <w:rPr>
+                <w:rFonts w:ascii="Times New Roman" w:hAnsi="Times New Roman"/>
+                <w:sz w:val="22"/>
+              </w:rPr>
+              <w:t>15,4% (baik)</w:t>
+            </w:r>
+          </w:p>
+        </w:tc>
+        <w:tc>
+          <w:tcPr>
+            <w:tcW w:type="dxa" w:w="1701"/>
+          </w:tcPr>
+          <w:p>
+            <w:pPr>
+              <w:jc w:val="left"/>
+            </w:pPr>
+            <w:r/>
+            <w:r>
+              <w:rPr>
+                <w:rFonts w:ascii="Times New Roman" w:hAnsi="Times New Roman"/>
+                <w:sz w:val="22"/>
+              </w:rPr>
+              <w:t>24,5%</w:t>
             </w:r>
           </w:p>
         </w:tc>
@@ -1415,30 +2215,16 @@
             <w:tcW w:type="dxa" w:w="1417"/>
           </w:tcPr>
           <w:p>
+            <w:pPr>
+              <w:jc w:val="left"/>
+            </w:pPr>
             <w:r/>
             <w:r>
               <w:rPr>
                 <w:rFonts w:ascii="Times New Roman" w:hAnsi="Times New Roman"/>
-                <w:b/>
                 <w:sz w:val="22"/>
               </w:rPr>
-              <w:t>Cakupan</w:t>
-            </w:r>
-          </w:p>
-        </w:tc>
-        <w:tc>
-          <w:tcPr>
-            <w:tcW w:type="dxa" w:w="1134"/>
-          </w:tcPr>
-          <w:p>
-            <w:r/>
-            <w:r>
-              <w:rPr>
-                <w:rFonts w:ascii="Times New Roman" w:hAnsi="Times New Roman"/>
-                <w:b/>
-                <w:sz w:val="22"/>
-              </w:rPr>
-              <w:t>Waktu</w:t>
+              <w:t>42,2%</w:t>
             </w:r>
           </w:p>
         </w:tc>
@@ -1446,16 +2232,55 @@
       <w:tr>
         <w:tc>
           <w:tcPr>
-            <w:tcW w:type="dxa" w:w="2551"/>
+            <w:tcW w:type="dxa" w:w="2835"/>
           </w:tcPr>
           <w:p>
+            <w:pPr>
+              <w:jc w:val="left"/>
+            </w:pPr>
             <w:r/>
             <w:r>
               <w:rPr>
                 <w:rFonts w:ascii="Times New Roman" w:hAnsi="Times New Roman"/>
                 <w:sz w:val="22"/>
               </w:rPr>
-              <w:t>holt_winters</w:t>
+              <w:t>Chronos-2 (pembanding)</w:t>
+            </w:r>
+          </w:p>
+        </w:tc>
+        <w:tc>
+          <w:tcPr>
+            <w:tcW w:type="dxa" w:w="2268"/>
+          </w:tcPr>
+          <w:p>
+            <w:pPr>
+              <w:jc w:val="left"/>
+            </w:pPr>
+            <w:r/>
+            <w:r>
+              <w:rPr>
+                <w:rFonts w:ascii="Times New Roman" w:hAnsi="Times New Roman"/>
+                <w:sz w:val="22"/>
+              </w:rPr>
+              <w:t>15,6% (baik)</w:t>
+            </w:r>
+          </w:p>
+        </w:tc>
+        <w:tc>
+          <w:tcPr>
+            <w:tcW w:type="dxa" w:w="1701"/>
+          </w:tcPr>
+          <w:p>
+            <w:pPr>
+              <w:jc w:val="left"/>
+            </w:pPr>
+            <w:r/>
+            <w:r>
+              <w:rPr>
+                <w:rFonts w:ascii="Times New Roman" w:hAnsi="Times New Roman"/>
+                <w:sz w:val="22"/>
+              </w:rPr>
+              <w:t>24,4%</w:t>
             </w:r>
           </w:p>
         </w:tc>
@@ -1464,13 +2289,72 @@
             <w:tcW w:type="dxa" w:w="1417"/>
           </w:tcPr>
           <w:p>
+            <w:pPr>
+              <w:jc w:val="left"/>
+            </w:pPr>
             <w:r/>
             <w:r>
               <w:rPr>
                 <w:rFonts w:ascii="Times New Roman" w:hAnsi="Times New Roman"/>
                 <w:sz w:val="22"/>
               </w:rPr>
-              <w:t>0,691</w:t>
+              <w:t>43,2%</w:t>
+            </w:r>
+          </w:p>
+        </w:tc>
+      </w:tr>
+      <w:tr>
+        <w:tc>
+          <w:tcPr>
+            <w:tcW w:type="dxa" w:w="2835"/>
+          </w:tcPr>
+          <w:p>
+            <w:pPr>
+              <w:jc w:val="left"/>
+            </w:pPr>
+            <w:r/>
+            <w:r>
+              <w:rPr>
+                <w:rFonts w:ascii="Times New Roman" w:hAnsi="Times New Roman"/>
+                <w:sz w:val="22"/>
+              </w:rPr>
+              <w:t>Aturan sederhana (rata-rata 28 hari)</w:t>
+            </w:r>
+          </w:p>
+        </w:tc>
+        <w:tc>
+          <w:tcPr>
+            <w:tcW w:type="dxa" w:w="2268"/>
+          </w:tcPr>
+          <w:p>
+            <w:pPr>
+              <w:jc w:val="left"/>
+            </w:pPr>
+            <w:r/>
+            <w:r>
+              <w:rPr>
+                <w:rFonts w:ascii="Times New Roman" w:hAnsi="Times New Roman"/>
+                <w:sz w:val="22"/>
+              </w:rPr>
+              <w:t>16,2% (baik)</w:t>
+            </w:r>
+          </w:p>
+        </w:tc>
+        <w:tc>
+          <w:tcPr>
+            <w:tcW w:type="dxa" w:w="1701"/>
+          </w:tcPr>
+          <w:p>
+            <w:pPr>
+              <w:jc w:val="left"/>
+            </w:pPr>
+            <w:r/>
+            <w:r>
+              <w:rPr>
+                <w:rFonts w:ascii="Times New Roman" w:hAnsi="Times New Roman"/>
+                <w:sz w:val="22"/>
+              </w:rPr>
+              <w:t>22,2%</w:t>
             </w:r>
           </w:p>
         </w:tc>
@@ -1479,13 +2363,72 @@
             <w:tcW w:type="dxa" w:w="1417"/>
           </w:tcPr>
           <w:p>
+            <w:pPr>
+              <w:jc w:val="left"/>
+            </w:pPr>
             <w:r/>
             <w:r>
               <w:rPr>
                 <w:rFonts w:ascii="Times New Roman" w:hAnsi="Times New Roman"/>
                 <w:sz w:val="22"/>
               </w:rPr>
-              <w:t>0,2864</w:t>
+              <w:t>46,9%</w:t>
+            </w:r>
+          </w:p>
+        </w:tc>
+      </w:tr>
+      <w:tr>
+        <w:tc>
+          <w:tcPr>
+            <w:tcW w:type="dxa" w:w="2835"/>
+          </w:tcPr>
+          <w:p>
+            <w:pPr>
+              <w:jc w:val="left"/>
+            </w:pPr>
+            <w:r/>
+            <w:r>
+              <w:rPr>
+                <w:rFonts w:ascii="Times New Roman" w:hAnsi="Times New Roman"/>
+                <w:sz w:val="22"/>
+              </w:rPr>
+              <w:t>Naif musiman</w:t>
+            </w:r>
+          </w:p>
+        </w:tc>
+        <w:tc>
+          <w:tcPr>
+            <w:tcW w:type="dxa" w:w="2268"/>
+          </w:tcPr>
+          <w:p>
+            <w:pPr>
+              <w:jc w:val="left"/>
+            </w:pPr>
+            <w:r/>
+            <w:r>
+              <w:rPr>
+                <w:rFonts w:ascii="Times New Roman" w:hAnsi="Times New Roman"/>
+                <w:sz w:val="22"/>
+              </w:rPr>
+              <w:t>19,4% (baik)</w:t>
+            </w:r>
+          </w:p>
+        </w:tc>
+        <w:tc>
+          <w:tcPr>
+            <w:tcW w:type="dxa" w:w="1701"/>
+          </w:tcPr>
+          <w:p>
+            <w:pPr>
+              <w:jc w:val="left"/>
+            </w:pPr>
+            <w:r/>
+            <w:r>
+              <w:rPr>
+                <w:rFonts w:ascii="Times New Roman" w:hAnsi="Times New Roman"/>
+                <w:sz w:val="22"/>
+              </w:rPr>
+              <w:t>28,1%</w:t>
             </w:r>
           </w:p>
         </w:tc>
@@ -1494,336 +2437,16 @@
             <w:tcW w:type="dxa" w:w="1417"/>
           </w:tcPr>
           <w:p>
+            <w:pPr>
+              <w:jc w:val="left"/>
+            </w:pPr>
             <w:r/>
             <w:r>
               <w:rPr>
                 <w:rFonts w:ascii="Times New Roman" w:hAnsi="Times New Roman"/>
                 <w:sz w:val="22"/>
               </w:rPr>
-              <w:t>81,4%</w:t>
-            </w:r>
-          </w:p>
-        </w:tc>
-        <w:tc>
-          <w:tcPr>
-            <w:tcW w:type="dxa" w:w="1134"/>
-          </w:tcPr>
-          <w:p>
-            <w:r/>
-            <w:r>
-              <w:rPr>
-                <w:rFonts w:ascii="Times New Roman" w:hAnsi="Times New Roman"/>
-                <w:sz w:val="22"/>
-              </w:rPr>
-              <w:t>397 d</w:t>
-            </w:r>
-          </w:p>
-        </w:tc>
-      </w:tr>
-      <w:tr>
-        <w:tc>
-          <w:tcPr>
-            <w:tcW w:type="dxa" w:w="2551"/>
-          </w:tcPr>
-          <w:p>
-            <w:r/>
-            <w:r>
-              <w:rPr>
-                <w:rFonts w:ascii="Times New Roman" w:hAnsi="Times New Roman"/>
-                <w:sz w:val="22"/>
-              </w:rPr>
-              <w:t>chronos_2</w:t>
-            </w:r>
-          </w:p>
-        </w:tc>
-        <w:tc>
-          <w:tcPr>
-            <w:tcW w:type="dxa" w:w="1417"/>
-          </w:tcPr>
-          <w:p>
-            <w:r/>
-            <w:r>
-              <w:rPr>
-                <w:rFonts w:ascii="Times New Roman" w:hAnsi="Times New Roman"/>
-                <w:sz w:val="22"/>
-              </w:rPr>
-              <w:t>0,697</w:t>
-            </w:r>
-          </w:p>
-        </w:tc>
-        <w:tc>
-          <w:tcPr>
-            <w:tcW w:type="dxa" w:w="1417"/>
-          </w:tcPr>
-          <w:p>
-            <w:r/>
-            <w:r>
-              <w:rPr>
-                <w:rFonts w:ascii="Times New Roman" w:hAnsi="Times New Roman"/>
-                <w:sz w:val="22"/>
-              </w:rPr>
-              <w:t>0,2874</w:t>
-            </w:r>
-          </w:p>
-        </w:tc>
-        <w:tc>
-          <w:tcPr>
-            <w:tcW w:type="dxa" w:w="1417"/>
-          </w:tcPr>
-          <w:p>
-            <w:r/>
-            <w:r>
-              <w:rPr>
-                <w:rFonts w:ascii="Times New Roman" w:hAnsi="Times New Roman"/>
-                <w:sz w:val="22"/>
-              </w:rPr>
-              <w:t>82,8%</w:t>
-            </w:r>
-          </w:p>
-        </w:tc>
-        <w:tc>
-          <w:tcPr>
-            <w:tcW w:type="dxa" w:w="1134"/>
-          </w:tcPr>
-          <w:p>
-            <w:r/>
-            <w:r>
-              <w:rPr>
-                <w:rFonts w:ascii="Times New Roman" w:hAnsi="Times New Roman"/>
-                <w:sz w:val="22"/>
-              </w:rPr>
-              <w:t>84 d</w:t>
-            </w:r>
-          </w:p>
-        </w:tc>
-      </w:tr>
-      <w:tr>
-        <w:tc>
-          <w:tcPr>
-            <w:tcW w:type="dxa" w:w="2551"/>
-          </w:tcPr>
-          <w:p>
-            <w:r/>
-            <w:r>
-              <w:rPr>
-                <w:rFonts w:ascii="Times New Roman" w:hAnsi="Times New Roman"/>
-                <w:sz w:val="22"/>
-              </w:rPr>
-              <w:t>kuantil_hari_pekan</w:t>
-            </w:r>
-          </w:p>
-        </w:tc>
-        <w:tc>
-          <w:tcPr>
-            <w:tcW w:type="dxa" w:w="1417"/>
-          </w:tcPr>
-          <w:p>
-            <w:r/>
-            <w:r>
-              <w:rPr>
-                <w:rFonts w:ascii="Times New Roman" w:hAnsi="Times New Roman"/>
-                <w:sz w:val="22"/>
-              </w:rPr>
-              <w:t>0,712</w:t>
-            </w:r>
-          </w:p>
-        </w:tc>
-        <w:tc>
-          <w:tcPr>
-            <w:tcW w:type="dxa" w:w="1417"/>
-          </w:tcPr>
-          <w:p>
-            <w:r/>
-            <w:r>
-              <w:rPr>
-                <w:rFonts w:ascii="Times New Roman" w:hAnsi="Times New Roman"/>
-                <w:sz w:val="22"/>
-              </w:rPr>
-              <w:t>0,3027</w:t>
-            </w:r>
-          </w:p>
-        </w:tc>
-        <w:tc>
-          <w:tcPr>
-            <w:tcW w:type="dxa" w:w="1417"/>
-          </w:tcPr>
-          <w:p>
-            <w:r/>
-            <w:r>
-              <w:rPr>
-                <w:rFonts w:ascii="Times New Roman" w:hAnsi="Times New Roman"/>
-                <w:sz w:val="22"/>
-              </w:rPr>
-              <w:t>70,3%</w:t>
-            </w:r>
-          </w:p>
-        </w:tc>
-        <w:tc>
-          <w:tcPr>
-            <w:tcW w:type="dxa" w:w="1134"/>
-          </w:tcPr>
-          <w:p>
-            <w:r/>
-            <w:r>
-              <w:rPr>
-                <w:rFonts w:ascii="Times New Roman" w:hAnsi="Times New Roman"/>
-                <w:sz w:val="22"/>
-              </w:rPr>
-              <w:t>7 d</w:t>
-            </w:r>
-          </w:p>
-        </w:tc>
-      </w:tr>
-      <w:tr>
-        <w:tc>
-          <w:tcPr>
-            <w:tcW w:type="dxa" w:w="2551"/>
-          </w:tcPr>
-          <w:p>
-            <w:r/>
-            <w:r>
-              <w:rPr>
-                <w:rFonts w:ascii="Times New Roman" w:hAnsi="Times New Roman"/>
-                <w:sz w:val="22"/>
-              </w:rPr>
-              <w:t>croston</w:t>
-            </w:r>
-          </w:p>
-        </w:tc>
-        <w:tc>
-          <w:tcPr>
-            <w:tcW w:type="dxa" w:w="1417"/>
-          </w:tcPr>
-          <w:p>
-            <w:r/>
-            <w:r>
-              <w:rPr>
-                <w:rFonts w:ascii="Times New Roman" w:hAnsi="Times New Roman"/>
-                <w:sz w:val="22"/>
-              </w:rPr>
-              <w:t>0,820</w:t>
-            </w:r>
-          </w:p>
-        </w:tc>
-        <w:tc>
-          <w:tcPr>
-            <w:tcW w:type="dxa" w:w="1417"/>
-          </w:tcPr>
-          <w:p>
-            <w:r/>
-            <w:r>
-              <w:rPr>
-                <w:rFonts w:ascii="Times New Roman" w:hAnsi="Times New Roman"/>
-                <w:sz w:val="22"/>
-              </w:rPr>
-              <w:t>0,3578</w:t>
-            </w:r>
-          </w:p>
-        </w:tc>
-        <w:tc>
-          <w:tcPr>
-            <w:tcW w:type="dxa" w:w="1417"/>
-          </w:tcPr>
-          <w:p>
-            <w:r/>
-            <w:r>
-              <w:rPr>
-                <w:rFonts w:ascii="Times New Roman" w:hAnsi="Times New Roman"/>
-                <w:sz w:val="22"/>
-              </w:rPr>
-              <w:t>90,9%</w:t>
-            </w:r>
-          </w:p>
-        </w:tc>
-        <w:tc>
-          <w:tcPr>
-            <w:tcW w:type="dxa" w:w="1134"/>
-          </w:tcPr>
-          <w:p>
-            <w:r/>
-            <w:r>
-              <w:rPr>
-                <w:rFonts w:ascii="Times New Roman" w:hAnsi="Times New Roman"/>
-                <w:sz w:val="22"/>
-              </w:rPr>
-              <w:t>3 d</w:t>
-            </w:r>
-          </w:p>
-        </w:tc>
-      </w:tr>
-      <w:tr>
-        <w:tc>
-          <w:tcPr>
-            <w:tcW w:type="dxa" w:w="2551"/>
-          </w:tcPr>
-          <w:p>
-            <w:r/>
-            <w:r>
-              <w:rPr>
-                <w:rFonts w:ascii="Times New Roman" w:hAnsi="Times New Roman"/>
-                <w:sz w:val="22"/>
-              </w:rPr>
-              <w:t>naif_musiman</w:t>
-            </w:r>
-          </w:p>
-        </w:tc>
-        <w:tc>
-          <w:tcPr>
-            <w:tcW w:type="dxa" w:w="1417"/>
-          </w:tcPr>
-          <w:p>
-            <w:r/>
-            <w:r>
-              <w:rPr>
-                <w:rFonts w:ascii="Times New Roman" w:hAnsi="Times New Roman"/>
-                <w:sz w:val="22"/>
-              </w:rPr>
-              <w:t>0,949</w:t>
-            </w:r>
-          </w:p>
-        </w:tc>
-        <w:tc>
-          <w:tcPr>
-            <w:tcW w:type="dxa" w:w="1417"/>
-          </w:tcPr>
-          <w:p>
-            <w:r/>
-            <w:r>
-              <w:rPr>
-                <w:rFonts w:ascii="Times New Roman" w:hAnsi="Times New Roman"/>
-                <w:sz w:val="22"/>
-              </w:rPr>
-              <w:t>0,4037</w:t>
-            </w:r>
-          </w:p>
-        </w:tc>
-        <w:tc>
-          <w:tcPr>
-            <w:tcW w:type="dxa" w:w="1417"/>
-          </w:tcPr>
-          <w:p>
-            <w:r/>
-            <w:r>
-              <w:rPr>
-                <w:rFonts w:ascii="Times New Roman" w:hAnsi="Times New Roman"/>
-                <w:sz w:val="22"/>
-              </w:rPr>
-              <w:t>80,5%</w:t>
-            </w:r>
-          </w:p>
-        </w:tc>
-        <w:tc>
-          <w:tcPr>
-            <w:tcW w:type="dxa" w:w="1134"/>
-          </w:tcPr>
-          <w:p>
-            <w:r/>
-            <w:r>
-              <w:rPr>
-                <w:rFonts w:ascii="Times New Roman" w:hAnsi="Times New Roman"/>
-                <w:sz w:val="22"/>
-              </w:rPr>
-              <w:t>4 d</w:t>
+              <w:t>56,4%</w:t>
             </w:r>
           </w:p>
         </w:tc>
@@ -1837,7 +2460,7 @@
       <w:r>
         <w:drawing>
           <wp:inline xmlns:a="http://schemas.openxmlformats.org/drawingml/2006/main" xmlns:pic="http://schemas.openxmlformats.org/drawingml/2006/picture">
-            <wp:extent cx="5220000" cy="1938944"/>
+            <wp:extent cx="5220000" cy="2740128"/>
             <wp:docPr id="3" name="Picture 3"/>
             <wp:cNvGraphicFramePr>
               <a:graphicFrameLocks noChangeAspect="1"/>
@@ -1846,7 +2469,7 @@
               <a:graphicData uri="http://schemas.openxmlformats.org/drawingml/2006/picture">
                 <pic:pic>
                   <pic:nvPicPr>
-                    <pic:cNvPr id="0" name="mesin1_banding.png"/>
+                    <pic:cNvPr id="0" name="mesin1_mape.png"/>
                     <pic:cNvPicPr/>
                   </pic:nvPicPr>
                   <pic:blipFill>
@@ -1858,7 +2481,7 @@
                   <pic:spPr>
                     <a:xfrm>
                       <a:off x="0" y="0"/>
-                      <a:ext cx="5220000" cy="1938944"/>
+                      <a:ext cx="5220000" cy="2740128"/>
                     </a:xfrm>
                     <a:prstGeom prst="rect"/>
                   </pic:spPr>
@@ -1879,7 +2502,692 @@
           <w:i/>
           <w:sz w:val="20"/>
         </w:rPr>
-        <w:t>Perbandingan metode Mesin 1.</w:t>
+        <w:t>MAPE unit di tiga tingkat; garis merah sasaran 5 persen.</w:t>
+      </w:r>
+    </w:p>
+    <w:tbl>
+      <w:tblPr>
+        <w:tblStyle w:val="LightGrid-Accent1"/>
+        <w:tblW w:type="auto" w:w="0"/>
+        <w:jc w:val="center"/>
+        <w:tblLook w:firstColumn="1" w:firstRow="1" w:lastColumn="0" w:lastRow="0" w:noHBand="0" w:noVBand="1" w:val="04A0"/>
+      </w:tblPr>
+      <w:tblGrid>
+        <w:gridCol w:w="3041"/>
+        <w:gridCol w:w="3041"/>
+        <w:gridCol w:w="3041"/>
+      </w:tblGrid>
+      <w:tr>
+        <w:tc>
+          <w:tcPr>
+            <w:tcW w:type="dxa" w:w="2835"/>
+          </w:tcPr>
+          <w:p>
+            <w:pPr>
+              <w:jc w:val="left"/>
+            </w:pPr>
+            <w:r/>
+            <w:r>
+              <w:rPr>
+                <w:rFonts w:ascii="Times New Roman" w:hAnsi="Times New Roman"/>
+                <w:b/>
+                <w:sz w:val="22"/>
+              </w:rPr>
+              <w:t>Omset</w:t>
+            </w:r>
+          </w:p>
+        </w:tc>
+        <w:tc>
+          <w:tcPr>
+            <w:tcW w:type="dxa" w:w="2835"/>
+          </w:tcPr>
+          <w:p>
+            <w:pPr>
+              <w:jc w:val="left"/>
+            </w:pPr>
+            <w:r/>
+            <w:r>
+              <w:rPr>
+                <w:rFonts w:ascii="Times New Roman" w:hAnsi="Times New Roman"/>
+                <w:b/>
+                <w:sz w:val="22"/>
+              </w:rPr>
+              <w:t>Metode</w:t>
+            </w:r>
+          </w:p>
+        </w:tc>
+        <w:tc>
+          <w:tcPr>
+            <w:tcW w:type="dxa" w:w="2551"/>
+          </w:tcPr>
+          <w:p>
+            <w:pPr>
+              <w:jc w:val="left"/>
+            </w:pPr>
+            <w:r/>
+            <w:r>
+              <w:rPr>
+                <w:rFonts w:ascii="Times New Roman" w:hAnsi="Times New Roman"/>
+                <w:b/>
+                <w:sz w:val="22"/>
+              </w:rPr>
+              <w:t>MAPE pekanan</w:t>
+            </w:r>
+          </w:p>
+        </w:tc>
+      </w:tr>
+      <w:tr>
+        <w:tc>
+          <w:tcPr>
+            <w:tcW w:type="dxa" w:w="2835"/>
+          </w:tcPr>
+          <w:p>
+            <w:pPr>
+              <w:jc w:val="left"/>
+            </w:pPr>
+            <w:r/>
+            <w:r>
+              <w:rPr>
+                <w:rFonts w:ascii="Times New Roman" w:hAnsi="Times New Roman"/>
+                <w:sz w:val="22"/>
+              </w:rPr>
+              <w:t>Simulasi Warungku</w:t>
+            </w:r>
+          </w:p>
+        </w:tc>
+        <w:tc>
+          <w:tcPr>
+            <w:tcW w:type="dxa" w:w="2835"/>
+          </w:tcPr>
+          <w:p>
+            <w:pPr>
+              <w:jc w:val="left"/>
+            </w:pPr>
+            <w:r/>
+            <w:r>
+              <w:rPr>
+                <w:rFonts w:ascii="Times New Roman" w:hAnsi="Times New Roman"/>
+                <w:sz w:val="22"/>
+              </w:rPr>
+              <w:t>SARIMAX</w:t>
+            </w:r>
+          </w:p>
+        </w:tc>
+        <w:tc>
+          <w:tcPr>
+            <w:tcW w:type="dxa" w:w="2551"/>
+          </w:tcPr>
+          <w:p>
+            <w:pPr>
+              <w:jc w:val="left"/>
+            </w:pPr>
+            <w:r/>
+            <w:r>
+              <w:rPr>
+                <w:rFonts w:ascii="Times New Roman" w:hAnsi="Times New Roman"/>
+                <w:sz w:val="22"/>
+              </w:rPr>
+              <w:t>8,8% (sangat akurat)</w:t>
+            </w:r>
+          </w:p>
+        </w:tc>
+      </w:tr>
+      <w:tr>
+        <w:tc>
+          <w:tcPr>
+            <w:tcW w:type="dxa" w:w="2835"/>
+          </w:tcPr>
+          <w:p>
+            <w:pPr>
+              <w:jc w:val="left"/>
+            </w:pPr>
+            <w:r/>
+            <w:r>
+              <w:rPr>
+                <w:rFonts w:ascii="Times New Roman" w:hAnsi="Times New Roman"/>
+                <w:sz w:val="22"/>
+              </w:rPr>
+              <w:t>Simulasi Warungku</w:t>
+            </w:r>
+          </w:p>
+        </w:tc>
+        <w:tc>
+          <w:tcPr>
+            <w:tcW w:type="dxa" w:w="2835"/>
+          </w:tcPr>
+          <w:p>
+            <w:pPr>
+              <w:jc w:val="left"/>
+            </w:pPr>
+            <w:r/>
+            <w:r>
+              <w:rPr>
+                <w:rFonts w:ascii="Times New Roman" w:hAnsi="Times New Roman"/>
+                <w:sz w:val="22"/>
+              </w:rPr>
+              <w:t>ETS / Holt-Winters</w:t>
+            </w:r>
+          </w:p>
+        </w:tc>
+        <w:tc>
+          <w:tcPr>
+            <w:tcW w:type="dxa" w:w="2551"/>
+          </w:tcPr>
+          <w:p>
+            <w:pPr>
+              <w:jc w:val="left"/>
+            </w:pPr>
+            <w:r/>
+            <w:r>
+              <w:rPr>
+                <w:rFonts w:ascii="Times New Roman" w:hAnsi="Times New Roman"/>
+                <w:sz w:val="22"/>
+              </w:rPr>
+              <w:t>11,0% (baik)</w:t>
+            </w:r>
+          </w:p>
+        </w:tc>
+      </w:tr>
+      <w:tr>
+        <w:tc>
+          <w:tcPr>
+            <w:tcW w:type="dxa" w:w="2835"/>
+          </w:tcPr>
+          <w:p>
+            <w:pPr>
+              <w:jc w:val="left"/>
+            </w:pPr>
+            <w:r/>
+            <w:r>
+              <w:rPr>
+                <w:rFonts w:ascii="Times New Roman" w:hAnsi="Times New Roman"/>
+                <w:sz w:val="22"/>
+              </w:rPr>
+              <w:t>Simulasi Warungku</w:t>
+            </w:r>
+          </w:p>
+        </w:tc>
+        <w:tc>
+          <w:tcPr>
+            <w:tcW w:type="dxa" w:w="2835"/>
+          </w:tcPr>
+          <w:p>
+            <w:pPr>
+              <w:jc w:val="left"/>
+            </w:pPr>
+            <w:r/>
+            <w:r>
+              <w:rPr>
+                <w:rFonts w:ascii="Times New Roman" w:hAnsi="Times New Roman"/>
+                <w:sz w:val="22"/>
+              </w:rPr>
+              <w:t>Chronos-2 (pembanding)</w:t>
+            </w:r>
+          </w:p>
+        </w:tc>
+        <w:tc>
+          <w:tcPr>
+            <w:tcW w:type="dxa" w:w="2551"/>
+          </w:tcPr>
+          <w:p>
+            <w:pPr>
+              <w:jc w:val="left"/>
+            </w:pPr>
+            <w:r/>
+            <w:r>
+              <w:rPr>
+                <w:rFonts w:ascii="Times New Roman" w:hAnsi="Times New Roman"/>
+                <w:sz w:val="22"/>
+              </w:rPr>
+              <w:t>11,2% (baik)</w:t>
+            </w:r>
+          </w:p>
+        </w:tc>
+      </w:tr>
+      <w:tr>
+        <w:tc>
+          <w:tcPr>
+            <w:tcW w:type="dxa" w:w="2835"/>
+          </w:tcPr>
+          <w:p>
+            <w:pPr>
+              <w:jc w:val="left"/>
+            </w:pPr>
+            <w:r/>
+            <w:r>
+              <w:rPr>
+                <w:rFonts w:ascii="Times New Roman" w:hAnsi="Times New Roman"/>
+                <w:sz w:val="22"/>
+              </w:rPr>
+              <w:t>Simulasi Warungku</w:t>
+            </w:r>
+          </w:p>
+        </w:tc>
+        <w:tc>
+          <w:tcPr>
+            <w:tcW w:type="dxa" w:w="2835"/>
+          </w:tcPr>
+          <w:p>
+            <w:pPr>
+              <w:jc w:val="left"/>
+            </w:pPr>
+            <w:r/>
+            <w:r>
+              <w:rPr>
+                <w:rFonts w:ascii="Times New Roman" w:hAnsi="Times New Roman"/>
+                <w:sz w:val="22"/>
+              </w:rPr>
+              <w:t>VAR (multivariat)</w:t>
+            </w:r>
+          </w:p>
+        </w:tc>
+        <w:tc>
+          <w:tcPr>
+            <w:tcW w:type="dxa" w:w="2551"/>
+          </w:tcPr>
+          <w:p>
+            <w:pPr>
+              <w:jc w:val="left"/>
+            </w:pPr>
+            <w:r/>
+            <w:r>
+              <w:rPr>
+                <w:rFonts w:ascii="Times New Roman" w:hAnsi="Times New Roman"/>
+                <w:sz w:val="22"/>
+              </w:rPr>
+              <w:t>12,9% (baik)</w:t>
+            </w:r>
+          </w:p>
+        </w:tc>
+      </w:tr>
+      <w:tr>
+        <w:tc>
+          <w:tcPr>
+            <w:tcW w:type="dxa" w:w="2835"/>
+          </w:tcPr>
+          <w:p>
+            <w:pPr>
+              <w:jc w:val="left"/>
+            </w:pPr>
+            <w:r/>
+            <w:r>
+              <w:rPr>
+                <w:rFonts w:ascii="Times New Roman" w:hAnsi="Times New Roman"/>
+                <w:sz w:val="22"/>
+              </w:rPr>
+              <w:t>Simulasi Warungku</w:t>
+            </w:r>
+          </w:p>
+        </w:tc>
+        <w:tc>
+          <w:tcPr>
+            <w:tcW w:type="dxa" w:w="2835"/>
+          </w:tcPr>
+          <w:p>
+            <w:pPr>
+              <w:jc w:val="left"/>
+            </w:pPr>
+            <w:r/>
+            <w:r>
+              <w:rPr>
+                <w:rFonts w:ascii="Times New Roman" w:hAnsi="Times New Roman"/>
+                <w:sz w:val="22"/>
+              </w:rPr>
+              <w:t>Naif musiman</w:t>
+            </w:r>
+          </w:p>
+        </w:tc>
+        <w:tc>
+          <w:tcPr>
+            <w:tcW w:type="dxa" w:w="2551"/>
+          </w:tcPr>
+          <w:p>
+            <w:pPr>
+              <w:jc w:val="left"/>
+            </w:pPr>
+            <w:r/>
+            <w:r>
+              <w:rPr>
+                <w:rFonts w:ascii="Times New Roman" w:hAnsi="Times New Roman"/>
+                <w:sz w:val="22"/>
+              </w:rPr>
+              <w:t>13,2% (baik)</w:t>
+            </w:r>
+          </w:p>
+        </w:tc>
+      </w:tr>
+      <w:tr>
+        <w:tc>
+          <w:tcPr>
+            <w:tcW w:type="dxa" w:w="2835"/>
+          </w:tcPr>
+          <w:p>
+            <w:pPr>
+              <w:jc w:val="left"/>
+            </w:pPr>
+            <w:r/>
+            <w:r>
+              <w:rPr>
+                <w:rFonts w:ascii="Times New Roman" w:hAnsi="Times New Roman"/>
+                <w:sz w:val="22"/>
+              </w:rPr>
+              <w:t>French Bakery (data nyata)</w:t>
+            </w:r>
+          </w:p>
+        </w:tc>
+        <w:tc>
+          <w:tcPr>
+            <w:tcW w:type="dxa" w:w="2835"/>
+          </w:tcPr>
+          <w:p>
+            <w:pPr>
+              <w:jc w:val="left"/>
+            </w:pPr>
+            <w:r/>
+            <w:r>
+              <w:rPr>
+                <w:rFonts w:ascii="Times New Roman" w:hAnsi="Times New Roman"/>
+                <w:sz w:val="22"/>
+              </w:rPr>
+              <w:t>Chronos-2 (pembanding)</w:t>
+            </w:r>
+          </w:p>
+        </w:tc>
+        <w:tc>
+          <w:tcPr>
+            <w:tcW w:type="dxa" w:w="2551"/>
+          </w:tcPr>
+          <w:p>
+            <w:pPr>
+              <w:jc w:val="left"/>
+            </w:pPr>
+            <w:r/>
+            <w:r>
+              <w:rPr>
+                <w:rFonts w:ascii="Times New Roman" w:hAnsi="Times New Roman"/>
+                <w:sz w:val="22"/>
+              </w:rPr>
+              <w:t>10,2% (baik)</w:t>
+            </w:r>
+          </w:p>
+        </w:tc>
+      </w:tr>
+      <w:tr>
+        <w:tc>
+          <w:tcPr>
+            <w:tcW w:type="dxa" w:w="2835"/>
+          </w:tcPr>
+          <w:p>
+            <w:pPr>
+              <w:jc w:val="left"/>
+            </w:pPr>
+            <w:r/>
+            <w:r>
+              <w:rPr>
+                <w:rFonts w:ascii="Times New Roman" w:hAnsi="Times New Roman"/>
+                <w:sz w:val="22"/>
+              </w:rPr>
+              <w:t>French Bakery (data nyata)</w:t>
+            </w:r>
+          </w:p>
+        </w:tc>
+        <w:tc>
+          <w:tcPr>
+            <w:tcW w:type="dxa" w:w="2835"/>
+          </w:tcPr>
+          <w:p>
+            <w:pPr>
+              <w:jc w:val="left"/>
+            </w:pPr>
+            <w:r/>
+            <w:r>
+              <w:rPr>
+                <w:rFonts w:ascii="Times New Roman" w:hAnsi="Times New Roman"/>
+                <w:sz w:val="22"/>
+              </w:rPr>
+              <w:t>SARIMAX</w:t>
+            </w:r>
+          </w:p>
+        </w:tc>
+        <w:tc>
+          <w:tcPr>
+            <w:tcW w:type="dxa" w:w="2551"/>
+          </w:tcPr>
+          <w:p>
+            <w:pPr>
+              <w:jc w:val="left"/>
+            </w:pPr>
+            <w:r/>
+            <w:r>
+              <w:rPr>
+                <w:rFonts w:ascii="Times New Roman" w:hAnsi="Times New Roman"/>
+                <w:sz w:val="22"/>
+              </w:rPr>
+              <w:t>11,9% (baik)</w:t>
+            </w:r>
+          </w:p>
+        </w:tc>
+      </w:tr>
+      <w:tr>
+        <w:tc>
+          <w:tcPr>
+            <w:tcW w:type="dxa" w:w="2835"/>
+          </w:tcPr>
+          <w:p>
+            <w:pPr>
+              <w:jc w:val="left"/>
+            </w:pPr>
+            <w:r/>
+            <w:r>
+              <w:rPr>
+                <w:rFonts w:ascii="Times New Roman" w:hAnsi="Times New Roman"/>
+                <w:sz w:val="22"/>
+              </w:rPr>
+              <w:t>French Bakery (data nyata)</w:t>
+            </w:r>
+          </w:p>
+        </w:tc>
+        <w:tc>
+          <w:tcPr>
+            <w:tcW w:type="dxa" w:w="2835"/>
+          </w:tcPr>
+          <w:p>
+            <w:pPr>
+              <w:jc w:val="left"/>
+            </w:pPr>
+            <w:r/>
+            <w:r>
+              <w:rPr>
+                <w:rFonts w:ascii="Times New Roman" w:hAnsi="Times New Roman"/>
+                <w:sz w:val="22"/>
+              </w:rPr>
+              <w:t>ETS / Holt-Winters</w:t>
+            </w:r>
+          </w:p>
+        </w:tc>
+        <w:tc>
+          <w:tcPr>
+            <w:tcW w:type="dxa" w:w="2551"/>
+          </w:tcPr>
+          <w:p>
+            <w:pPr>
+              <w:jc w:val="left"/>
+            </w:pPr>
+            <w:r/>
+            <w:r>
+              <w:rPr>
+                <w:rFonts w:ascii="Times New Roman" w:hAnsi="Times New Roman"/>
+                <w:sz w:val="22"/>
+              </w:rPr>
+              <w:t>13,6% (baik)</w:t>
+            </w:r>
+          </w:p>
+        </w:tc>
+      </w:tr>
+      <w:tr>
+        <w:tc>
+          <w:tcPr>
+            <w:tcW w:type="dxa" w:w="2835"/>
+          </w:tcPr>
+          <w:p>
+            <w:pPr>
+              <w:jc w:val="left"/>
+            </w:pPr>
+            <w:r/>
+            <w:r>
+              <w:rPr>
+                <w:rFonts w:ascii="Times New Roman" w:hAnsi="Times New Roman"/>
+                <w:sz w:val="22"/>
+              </w:rPr>
+              <w:t>French Bakery (data nyata)</w:t>
+            </w:r>
+          </w:p>
+        </w:tc>
+        <w:tc>
+          <w:tcPr>
+            <w:tcW w:type="dxa" w:w="2835"/>
+          </w:tcPr>
+          <w:p>
+            <w:pPr>
+              <w:jc w:val="left"/>
+            </w:pPr>
+            <w:r/>
+            <w:r>
+              <w:rPr>
+                <w:rFonts w:ascii="Times New Roman" w:hAnsi="Times New Roman"/>
+                <w:sz w:val="22"/>
+              </w:rPr>
+              <w:t>VAR (multivariat)</w:t>
+            </w:r>
+          </w:p>
+        </w:tc>
+        <w:tc>
+          <w:tcPr>
+            <w:tcW w:type="dxa" w:w="2551"/>
+          </w:tcPr>
+          <w:p>
+            <w:pPr>
+              <w:jc w:val="left"/>
+            </w:pPr>
+            <w:r/>
+            <w:r>
+              <w:rPr>
+                <w:rFonts w:ascii="Times New Roman" w:hAnsi="Times New Roman"/>
+                <w:sz w:val="22"/>
+              </w:rPr>
+              <w:t>14,9% (baik)</w:t>
+            </w:r>
+          </w:p>
+        </w:tc>
+      </w:tr>
+      <w:tr>
+        <w:tc>
+          <w:tcPr>
+            <w:tcW w:type="dxa" w:w="2835"/>
+          </w:tcPr>
+          <w:p>
+            <w:pPr>
+              <w:jc w:val="left"/>
+            </w:pPr>
+            <w:r/>
+            <w:r>
+              <w:rPr>
+                <w:rFonts w:ascii="Times New Roman" w:hAnsi="Times New Roman"/>
+                <w:sz w:val="22"/>
+              </w:rPr>
+              <w:t>French Bakery (data nyata)</w:t>
+            </w:r>
+          </w:p>
+        </w:tc>
+        <w:tc>
+          <w:tcPr>
+            <w:tcW w:type="dxa" w:w="2835"/>
+          </w:tcPr>
+          <w:p>
+            <w:pPr>
+              <w:jc w:val="left"/>
+            </w:pPr>
+            <w:r/>
+            <w:r>
+              <w:rPr>
+                <w:rFonts w:ascii="Times New Roman" w:hAnsi="Times New Roman"/>
+                <w:sz w:val="22"/>
+              </w:rPr>
+              <w:t>Naif musiman</w:t>
+            </w:r>
+          </w:p>
+        </w:tc>
+        <w:tc>
+          <w:tcPr>
+            <w:tcW w:type="dxa" w:w="2551"/>
+          </w:tcPr>
+          <w:p>
+            <w:pPr>
+              <w:jc w:val="left"/>
+            </w:pPr>
+            <w:r/>
+            <w:r>
+              <w:rPr>
+                <w:rFonts w:ascii="Times New Roman" w:hAnsi="Times New Roman"/>
+                <w:sz w:val="22"/>
+              </w:rPr>
+              <w:t>15,2% (baik)</w:t>
+            </w:r>
+          </w:p>
+        </w:tc>
+      </w:tr>
+    </w:tbl>
+    <w:p/>
+    <w:p>
+      <w:pPr>
+        <w:jc w:val="center"/>
+      </w:pPr>
+      <w:r>
+        <w:drawing>
+          <wp:inline xmlns:a="http://schemas.openxmlformats.org/drawingml/2006/main" xmlns:pic="http://schemas.openxmlformats.org/drawingml/2006/picture">
+            <wp:extent cx="5220000" cy="1951402"/>
+            <wp:docPr id="4" name="Picture 4"/>
+            <wp:cNvGraphicFramePr>
+              <a:graphicFrameLocks noChangeAspect="1"/>
+            </wp:cNvGraphicFramePr>
+            <a:graphic>
+              <a:graphicData uri="http://schemas.openxmlformats.org/drawingml/2006/picture">
+                <pic:pic>
+                  <pic:nvPicPr>
+                    <pic:cNvPr id="0" name="mesin1_omset.png"/>
+                    <pic:cNvPicPr/>
+                  </pic:nvPicPr>
+                  <pic:blipFill>
+                    <a:blip r:embed="rId12"/>
+                    <a:stretch>
+                      <a:fillRect/>
+                    </a:stretch>
+                  </pic:blipFill>
+                  <pic:spPr>
+                    <a:xfrm>
+                      <a:off x="0" y="0"/>
+                      <a:ext cx="5220000" cy="1951402"/>
+                    </a:xfrm>
+                    <a:prstGeom prst="rect"/>
+                  </pic:spPr>
+                </pic:pic>
+              </a:graphicData>
+            </a:graphic>
+          </wp:inline>
+        </w:drawing>
+      </w:r>
+    </w:p>
+    <w:p>
+      <w:pPr>
+        <w:jc w:val="center"/>
+      </w:pPr>
+      <w:r>
+        <w:rPr>
+          <w:rFonts w:ascii="Times New Roman" w:hAnsi="Times New Roman"/>
+          <w:i/>
+          <w:sz w:val="20"/>
+        </w:rPr>
+        <w:t>MAPE pekanan omset, simulasi dan toko roti sungguhan.</w:t>
       </w:r>
     </w:p>
     <w:p>
@@ -1892,7 +3200,7 @@
           <w:b/>
           <w:sz w:val="24"/>
         </w:rPr>
-        <w:t>Metrik utama WQL, bukan MAPE.</w:t>
+        <w:t>Sasaran 5 persen belum tercapai.</w:t>
       </w:r>
     </w:p>
     <w:p>
@@ -1905,7 +3213,33 @@
           <w:b w:val="0"/>
           <w:sz w:val="24"/>
         </w:rPr>
-        <w:t>MAPE membagi dengan nilai sebenarnya, dan permintaan harian sering nol. Pembagian dengan nol kadang dibuang diam-diam oleh pustaka, dan yang terbuang justru hari-hari paling penting.</w:t>
+        <w:t>Derau acak penjualan per barang per pekan sudah lebih besar dari 5 persen untuk barang yang terjual di bawah sekitar 255 unit sepekan, bahkan untuk ramalan yang sempurna. Omset lebih mudah karena derau banyak barang saling meniadakan.</w:t>
+      </w:r>
+    </w:p>
+    <w:p>
+      <w:pPr>
+        <w:jc w:val="both"/>
+      </w:pPr>
+      <w:r>
+        <w:rPr>
+          <w:rFonts w:ascii="Times New Roman" w:hAnsi="Times New Roman"/>
+          <w:b/>
+          <w:sz w:val="24"/>
+        </w:rPr>
+        <w:t>Kenapa ETS untuk produksi.</w:t>
+      </w:r>
+    </w:p>
+    <w:p>
+      <w:pPr>
+        <w:jc w:val="both"/>
+      </w:pPr>
+      <w:r>
+        <w:rPr>
+          <w:rFonts w:ascii="Times New Roman" w:hAnsi="Times New Roman"/>
+          <w:b w:val="0"/>
+          <w:sz w:val="24"/>
+        </w:rPr>
+        <w:t>Setara Chronos-2 dalam akurasi, dan setiap parameternya bisa dijelaskan per barang. Chronos-2 tetap sebagai pembanding; SARIMAX dan VAR (multivariat: omset, jumlah barang, jumlah nota) untuk omset.</w:t>
       </w:r>
     </w:p>
     <w:p>
@@ -1913,7 +3247,7 @@
         <w:pStyle w:val="Heading1"/>
       </w:pPr>
       <w:r>
-        <w:t>F. Mesin 2 — saran distributor — bagian 7</w:t>
+        <w:t>F. Mesin 2 — saran dan segmentasi distributor — bagian 7</w:t>
       </w:r>
     </w:p>
     <w:p>
@@ -1939,7 +3273,7 @@
           <w:b w:val="0"/>
           <w:sz w:val="24"/>
         </w:rPr>
-        <w:t>Ke distributor mana sebaiknya memesan barang ini, untuk warung ini, hari ini. Bukan per UMKM sekali untuk selamanya: jawabannya berubah menurut barang, ukuran pesanan, cuaca, jarak, dan minimum pesanan.</w:t>
+        <w:t>Ke distributor mana sebaiknya memesan barang ini, dan distributor mana yang sangat layak, layak, atau kurang layak.</w:t>
       </w:r>
     </w:p>
     <w:p>
@@ -1952,7 +3286,7 @@
           <w:b/>
           <w:sz w:val="24"/>
         </w:rPr>
-        <w:t>Kenapa dibingkai sebagai contextual bandit.</w:t>
+        <w:t>Cara kerjanya.</w:t>
       </w:r>
     </w:p>
     <w:p>
@@ -1965,7 +3299,7 @@
           <w:rFonts w:ascii="Times New Roman" w:hAnsi="Times New Roman"/>
           <w:sz w:val="24"/>
         </w:rPr>
-        <w:t>Umpan balik sebagian: hanya hasil distributor yang dipesan yang terlihat.</w:t>
+        <w:t>Bayesian: tiap distributor punya Beta(a, b); pesanan mulus menambah a, pesanan gagal menambah b. Keandalan = a / (a + b).</w:t>
       </w:r>
     </w:p>
     <w:p>
@@ -1978,7 +3312,7 @@
           <w:rFonts w:ascii="Times New Roman" w:hAnsi="Times New Roman"/>
           <w:sz w:val="24"/>
         </w:rPr>
-        <w:t>Keputusan hari ini menentukan data besok.</w:t>
+        <w:t>Thompson sampling: cuplik satu angka dari tiap Beta, urutkan. Distributor yang jarang dicoba tetap mendapat kesempatan.</w:t>
       </w:r>
     </w:p>
     <w:p>
@@ -1991,20 +3325,7 @@
           <w:rFonts w:ascii="Times New Roman" w:hAnsi="Times New Roman"/>
           <w:sz w:val="24"/>
         </w:rPr>
-        <w:t>Metrik aslinya regret, bukan akurasi.</w:t>
-      </w:r>
-    </w:p>
-    <w:p>
-      <w:pPr>
-        <w:jc w:val="both"/>
-      </w:pPr>
-      <w:r>
-        <w:rPr>
-          <w:rFonts w:ascii="Times New Roman" w:hAnsi="Times New Roman"/>
-          <w:b/>
-          <w:sz w:val="24"/>
-        </w:rPr>
-        <w:t>Kenapa BART sebagai penaksir.</w:t>
+        <w:t>Fuzzy Sugeno: keandalan dan rasio harga, 3 x 3 aturan, menjadi skor 0–1. Skor ≥ 0,70 sangat layak, ≥ 0,45 layak.</w:t>
       </w:r>
     </w:p>
     <w:p>
@@ -2017,7 +3338,7 @@
           <w:b w:val="0"/>
           <w:sz w:val="24"/>
         </w:rPr>
-        <w:t>Posteriornya asli, jadi Thompson sampling tinggal mencuplik tanpa heuristik. Silsilahnya juga cocok: BART dirancang untuk menaksir hasil yang akan terjadi seandainya diberi perlakuan lain — persis bentuk matriks counterfactual kami. TabPFN dilepas karena bukan zero-shot seperti yang dikira, dan versi barunya berpagar akun serta lisensi.</w:t>
+        <w:t>Produksi: 187 sangat layak, 128 layak, 67 kurang layak.</w:t>
       </w:r>
     </w:p>
     <w:tbl>
@@ -2036,9 +3357,12 @@
       <w:tr>
         <w:tc>
           <w:tcPr>
-            <w:tcW w:type="dxa" w:w="3118"/>
+            <w:tcW w:type="dxa" w:w="3288"/>
           </w:tcPr>
           <w:p>
+            <w:pPr>
+              <w:jc w:val="left"/>
+            </w:pPr>
             <w:r/>
             <w:r>
               <w:rPr>
@@ -2046,15 +3370,18 @@
                 <w:b/>
                 <w:sz w:val="22"/>
               </w:rPr>
-              <w:t>Kebijakan + penaksir</w:t>
+              <w:t>Varian</w:t>
             </w:r>
           </w:p>
         </w:tc>
         <w:tc>
           <w:tcPr>
-            <w:tcW w:type="dxa" w:w="1701"/>
+            <w:tcW w:type="dxa" w:w="1474"/>
           </w:tcPr>
           <w:p>
+            <w:pPr>
+              <w:jc w:val="left"/>
+            </w:pPr>
             <w:r/>
             <w:r>
               <w:rPr>
@@ -2068,9 +3395,12 @@
         </w:tc>
         <w:tc>
           <w:tcPr>
-            <w:tcW w:type="dxa" w:w="1984"/>
+            <w:tcW w:type="dxa" w:w="1814"/>
           </w:tcPr>
           <w:p>
+            <w:pPr>
+              <w:jc w:val="left"/>
+            </w:pPr>
             <w:r/>
             <w:r>
               <w:rPr>
@@ -2084,9 +3414,12 @@
         </w:tc>
         <w:tc>
           <w:tcPr>
-            <w:tcW w:type="dxa" w:w="1417"/>
+            <w:tcW w:type="dxa" w:w="1474"/>
           </w:tcPr>
           <w:p>
+            <w:pPr>
+              <w:jc w:val="left"/>
+            </w:pPr>
             <w:r/>
             <w:r>
               <w:rPr>
@@ -2094,7 +3427,7 @@
                 <w:b/>
                 <w:sz w:val="22"/>
               </w:rPr>
-              <w:t>Sukses</w:t>
+              <w:t>Rasio harga</w:t>
             </w:r>
           </w:p>
         </w:tc>
@@ -2102,61 +3435,73 @@
       <w:tr>
         <w:tc>
           <w:tcPr>
-            <w:tcW w:type="dxa" w:w="3118"/>
+            <w:tcW w:type="dxa" w:w="3288"/>
           </w:tcPr>
           <w:p>
+            <w:pPr>
+              <w:jc w:val="left"/>
+            </w:pPr>
             <w:r/>
             <w:r>
               <w:rPr>
                 <w:rFonts w:ascii="Times New Roman" w:hAnsi="Times New Roman"/>
                 <w:sz w:val="22"/>
               </w:rPr>
-              <w:t>Oracle (batas atas)</w:t>
+              <w:t>beta_daring+greedy</w:t>
             </w:r>
           </w:p>
         </w:tc>
         <w:tc>
           <w:tcPr>
-            <w:tcW w:type="dxa" w:w="1701"/>
+            <w:tcW w:type="dxa" w:w="1474"/>
           </w:tcPr>
           <w:p>
+            <w:pPr>
+              <w:jc w:val="left"/>
+            </w:pPr>
             <w:r/>
             <w:r>
               <w:rPr>
                 <w:rFonts w:ascii="Times New Roman" w:hAnsi="Times New Roman"/>
                 <w:sz w:val="22"/>
               </w:rPr>
-              <w:t>0</w:t>
+              <w:t>1.383</w:t>
             </w:r>
           </w:p>
         </w:tc>
         <w:tc>
           <w:tcPr>
-            <w:tcW w:type="dxa" w:w="1984"/>
+            <w:tcW w:type="dxa" w:w="1814"/>
           </w:tcPr>
           <w:p>
+            <w:pPr>
+              <w:jc w:val="left"/>
+            </w:pPr>
             <w:r/>
             <w:r>
               <w:rPr>
                 <w:rFonts w:ascii="Times New Roman" w:hAnsi="Times New Roman"/>
                 <w:sz w:val="22"/>
               </w:rPr>
-              <w:t>0,0000</w:t>
+              <w:t>0,1483</w:t>
             </w:r>
           </w:p>
         </w:tc>
         <w:tc>
           <w:tcPr>
-            <w:tcW w:type="dxa" w:w="1417"/>
+            <w:tcW w:type="dxa" w:w="1474"/>
           </w:tcPr>
           <w:p>
+            <w:pPr>
+              <w:jc w:val="left"/>
+            </w:pPr>
             <w:r/>
             <w:r>
               <w:rPr>
                 <w:rFonts w:ascii="Times New Roman" w:hAnsi="Times New Roman"/>
                 <w:sz w:val="22"/>
               </w:rPr>
-              <w:t>0,9339</w:t>
+              <w:t>1,0509</w:t>
             </w:r>
           </w:p>
         </w:tc>
@@ -2164,61 +3509,73 @@
       <w:tr>
         <w:tc>
           <w:tcPr>
-            <w:tcW w:type="dxa" w:w="3118"/>
+            <w:tcW w:type="dxa" w:w="3288"/>
           </w:tcPr>
           <w:p>
+            <w:pPr>
+              <w:jc w:val="left"/>
+            </w:pPr>
             <w:r/>
             <w:r>
               <w:rPr>
                 <w:rFonts w:ascii="Times New Roman" w:hAnsi="Times New Roman"/>
                 <w:sz w:val="22"/>
               </w:rPr>
-              <w:t>logistik+greedy</w:t>
+              <w:t>beta_daring+linucb_a1</w:t>
             </w:r>
           </w:p>
         </w:tc>
         <w:tc>
           <w:tcPr>
-            <w:tcW w:type="dxa" w:w="1701"/>
+            <w:tcW w:type="dxa" w:w="1474"/>
           </w:tcPr>
           <w:p>
+            <w:pPr>
+              <w:jc w:val="left"/>
+            </w:pPr>
             <w:r/>
             <w:r>
               <w:rPr>
                 <w:rFonts w:ascii="Times New Roman" w:hAnsi="Times New Roman"/>
                 <w:sz w:val="22"/>
               </w:rPr>
-              <w:t>1462</w:t>
+              <w:t>1.383</w:t>
             </w:r>
           </w:p>
         </w:tc>
         <w:tc>
           <w:tcPr>
-            <w:tcW w:type="dxa" w:w="1984"/>
+            <w:tcW w:type="dxa" w:w="1814"/>
           </w:tcPr>
           <w:p>
+            <w:pPr>
+              <w:jc w:val="left"/>
+            </w:pPr>
             <w:r/>
             <w:r>
               <w:rPr>
                 <w:rFonts w:ascii="Times New Roman" w:hAnsi="Times New Roman"/>
                 <w:sz w:val="22"/>
               </w:rPr>
-              <w:t>0,1567</w:t>
+              <w:t>0,1483</w:t>
             </w:r>
           </w:p>
         </w:tc>
         <w:tc>
           <w:tcPr>
-            <w:tcW w:type="dxa" w:w="1417"/>
+            <w:tcW w:type="dxa" w:w="1474"/>
           </w:tcPr>
           <w:p>
+            <w:pPr>
+              <w:jc w:val="left"/>
+            </w:pPr>
             <w:r/>
             <w:r>
               <w:rPr>
                 <w:rFonts w:ascii="Times New Roman" w:hAnsi="Times New Roman"/>
                 <w:sz w:val="22"/>
               </w:rPr>
-              <w:t>0,777</w:t>
+              <w:t>1,0510</w:t>
             </w:r>
           </w:p>
         </w:tc>
@@ -2226,61 +3583,73 @@
       <w:tr>
         <w:tc>
           <w:tcPr>
-            <w:tcW w:type="dxa" w:w="3118"/>
+            <w:tcW w:type="dxa" w:w="3288"/>
           </w:tcPr>
           <w:p>
+            <w:pPr>
+              <w:jc w:val="left"/>
+            </w:pPr>
             <w:r/>
             <w:r>
               <w:rPr>
                 <w:rFonts w:ascii="Times New Roman" w:hAnsi="Times New Roman"/>
                 <w:sz w:val="22"/>
               </w:rPr>
-              <w:t>logistik+epsilon_greedy_0.1</w:t>
+              <w:t>beta+thompson</w:t>
             </w:r>
           </w:p>
         </w:tc>
         <w:tc>
           <w:tcPr>
-            <w:tcW w:type="dxa" w:w="1701"/>
+            <w:tcW w:type="dxa" w:w="1474"/>
           </w:tcPr>
           <w:p>
+            <w:pPr>
+              <w:jc w:val="left"/>
+            </w:pPr>
             <w:r/>
             <w:r>
               <w:rPr>
                 <w:rFonts w:ascii="Times New Roman" w:hAnsi="Times New Roman"/>
                 <w:sz w:val="22"/>
               </w:rPr>
-              <w:t>1462</w:t>
+              <w:t>1.419</w:t>
             </w:r>
           </w:p>
         </w:tc>
         <w:tc>
           <w:tcPr>
-            <w:tcW w:type="dxa" w:w="1984"/>
+            <w:tcW w:type="dxa" w:w="1814"/>
           </w:tcPr>
           <w:p>
+            <w:pPr>
+              <w:jc w:val="left"/>
+            </w:pPr>
             <w:r/>
             <w:r>
               <w:rPr>
                 <w:rFonts w:ascii="Times New Roman" w:hAnsi="Times New Roman"/>
                 <w:sz w:val="22"/>
               </w:rPr>
-              <w:t>0,1567</w:t>
+              <w:t>0,1521</w:t>
             </w:r>
           </w:p>
         </w:tc>
         <w:tc>
           <w:tcPr>
-            <w:tcW w:type="dxa" w:w="1417"/>
+            <w:tcW w:type="dxa" w:w="1474"/>
           </w:tcPr>
           <w:p>
+            <w:pPr>
+              <w:jc w:val="left"/>
+            </w:pPr>
             <w:r/>
             <w:r>
               <w:rPr>
                 <w:rFonts w:ascii="Times New Roman" w:hAnsi="Times New Roman"/>
                 <w:sz w:val="22"/>
               </w:rPr>
-              <w:t>0,777</w:t>
+              <w:t>1,0613</w:t>
             </w:r>
           </w:p>
         </w:tc>
@@ -2288,61 +3657,73 @@
       <w:tr>
         <w:tc>
           <w:tcPr>
-            <w:tcW w:type="dxa" w:w="3118"/>
+            <w:tcW w:type="dxa" w:w="3288"/>
           </w:tcPr>
           <w:p>
+            <w:pPr>
+              <w:jc w:val="left"/>
+            </w:pPr>
             <w:r/>
             <w:r>
               <w:rPr>
                 <w:rFonts w:ascii="Times New Roman" w:hAnsi="Times New Roman"/>
                 <w:sz w:val="22"/>
               </w:rPr>
-              <w:t>logistik+linucb_a1</w:t>
+              <w:t>beta_daring+thompson</w:t>
             </w:r>
           </w:p>
         </w:tc>
         <w:tc>
           <w:tcPr>
-            <w:tcW w:type="dxa" w:w="1701"/>
+            <w:tcW w:type="dxa" w:w="1474"/>
           </w:tcPr>
           <w:p>
+            <w:pPr>
+              <w:jc w:val="left"/>
+            </w:pPr>
             <w:r/>
             <w:r>
               <w:rPr>
                 <w:rFonts w:ascii="Times New Roman" w:hAnsi="Times New Roman"/>
                 <w:sz w:val="22"/>
               </w:rPr>
-              <w:t>1470</w:t>
+              <w:t>1.420</w:t>
             </w:r>
           </w:p>
         </w:tc>
         <w:tc>
           <w:tcPr>
-            <w:tcW w:type="dxa" w:w="1984"/>
+            <w:tcW w:type="dxa" w:w="1814"/>
           </w:tcPr>
           <w:p>
+            <w:pPr>
+              <w:jc w:val="left"/>
+            </w:pPr>
             <w:r/>
             <w:r>
               <w:rPr>
                 <w:rFonts w:ascii="Times New Roman" w:hAnsi="Times New Roman"/>
                 <w:sz w:val="22"/>
               </w:rPr>
-              <w:t>0,1576</w:t>
+              <w:t>0,1522</w:t>
             </w:r>
           </w:p>
         </w:tc>
         <w:tc>
           <w:tcPr>
-            <w:tcW w:type="dxa" w:w="1417"/>
+            <w:tcW w:type="dxa" w:w="1474"/>
           </w:tcPr>
           <w:p>
+            <w:pPr>
+              <w:jc w:val="left"/>
+            </w:pPr>
             <w:r/>
             <w:r>
               <w:rPr>
                 <w:rFonts w:ascii="Times New Roman" w:hAnsi="Times New Roman"/>
                 <w:sz w:val="22"/>
               </w:rPr>
-              <w:t>0,776</w:t>
+              <w:t>1,0552</w:t>
             </w:r>
           </w:p>
         </w:tc>
@@ -2350,9 +3731,86 @@
       <w:tr>
         <w:tc>
           <w:tcPr>
-            <w:tcW w:type="dxa" w:w="3118"/>
+            <w:tcW w:type="dxa" w:w="3288"/>
           </w:tcPr>
           <w:p>
+            <w:pPr>
+              <w:jc w:val="left"/>
+            </w:pPr>
+            <w:r/>
+            <w:r>
+              <w:rPr>
+                <w:rFonts w:ascii="Times New Roman" w:hAnsi="Times New Roman"/>
+                <w:sz w:val="22"/>
+              </w:rPr>
+              <w:t>beta_daring+epsilon_greedy_0.1</w:t>
+            </w:r>
+          </w:p>
+        </w:tc>
+        <w:tc>
+          <w:tcPr>
+            <w:tcW w:type="dxa" w:w="1474"/>
+          </w:tcPr>
+          <w:p>
+            <w:pPr>
+              <w:jc w:val="left"/>
+            </w:pPr>
+            <w:r/>
+            <w:r>
+              <w:rPr>
+                <w:rFonts w:ascii="Times New Roman" w:hAnsi="Times New Roman"/>
+                <w:sz w:val="22"/>
+              </w:rPr>
+              <w:t>1.432</w:t>
+            </w:r>
+          </w:p>
+        </w:tc>
+        <w:tc>
+          <w:tcPr>
+            <w:tcW w:type="dxa" w:w="1814"/>
+          </w:tcPr>
+          <w:p>
+            <w:pPr>
+              <w:jc w:val="left"/>
+            </w:pPr>
+            <w:r/>
+            <w:r>
+              <w:rPr>
+                <w:rFonts w:ascii="Times New Roman" w:hAnsi="Times New Roman"/>
+                <w:sz w:val="22"/>
+              </w:rPr>
+              <w:t>0,1535</w:t>
+            </w:r>
+          </w:p>
+        </w:tc>
+        <w:tc>
+          <w:tcPr>
+            <w:tcW w:type="dxa" w:w="1474"/>
+          </w:tcPr>
+          <w:p>
+            <w:pPr>
+              <w:jc w:val="left"/>
+            </w:pPr>
+            <w:r/>
+            <w:r>
+              <w:rPr>
+                <w:rFonts w:ascii="Times New Roman" w:hAnsi="Times New Roman"/>
+                <w:sz w:val="22"/>
+              </w:rPr>
+              <w:t>1,0510</w:t>
+            </w:r>
+          </w:p>
+        </w:tc>
+      </w:tr>
+      <w:tr>
+        <w:tc>
+          <w:tcPr>
+            <w:tcW w:type="dxa" w:w="3288"/>
+          </w:tcPr>
+          <w:p>
+            <w:pPr>
+              <w:jc w:val="left"/>
+            </w:pPr>
             <w:r/>
             <w:r>
               <w:rPr>
@@ -2365,46 +3823,55 @@
         </w:tc>
         <w:tc>
           <w:tcPr>
-            <w:tcW w:type="dxa" w:w="1701"/>
+            <w:tcW w:type="dxa" w:w="1474"/>
           </w:tcPr>
           <w:p>
+            <w:pPr>
+              <w:jc w:val="left"/>
+            </w:pPr>
             <w:r/>
             <w:r>
               <w:rPr>
                 <w:rFonts w:ascii="Times New Roman" w:hAnsi="Times New Roman"/>
                 <w:sz w:val="22"/>
               </w:rPr>
-              <w:t>1501</w:t>
+              <w:t>1.479</w:t>
             </w:r>
           </w:p>
         </w:tc>
         <w:tc>
           <w:tcPr>
-            <w:tcW w:type="dxa" w:w="1984"/>
+            <w:tcW w:type="dxa" w:w="1814"/>
           </w:tcPr>
           <w:p>
+            <w:pPr>
+              <w:jc w:val="left"/>
+            </w:pPr>
             <w:r/>
             <w:r>
               <w:rPr>
                 <w:rFonts w:ascii="Times New Roman" w:hAnsi="Times New Roman"/>
                 <w:sz w:val="22"/>
               </w:rPr>
-              <w:t>0,1609</w:t>
+              <w:t>0,1586</w:t>
             </w:r>
           </w:p>
         </w:tc>
         <w:tc>
           <w:tcPr>
-            <w:tcW w:type="dxa" w:w="1417"/>
+            <w:tcW w:type="dxa" w:w="1474"/>
           </w:tcPr>
           <w:p>
+            <w:pPr>
+              <w:jc w:val="left"/>
+            </w:pPr>
             <w:r/>
             <w:r>
               <w:rPr>
                 <w:rFonts w:ascii="Times New Roman" w:hAnsi="Times New Roman"/>
                 <w:sz w:val="22"/>
               </w:rPr>
-              <w:t>0,773</w:t>
+              <w:t>1,0686</w:t>
             </w:r>
           </w:p>
         </w:tc>
@@ -2412,9 +3879,160 @@
       <w:tr>
         <w:tc>
           <w:tcPr>
-            <w:tcW w:type="dxa" w:w="3118"/>
+            <w:tcW w:type="dxa" w:w="3288"/>
           </w:tcPr>
           <w:p>
+            <w:pPr>
+              <w:jc w:val="left"/>
+            </w:pPr>
+            <w:r/>
+            <w:r>
+              <w:rPr>
+                <w:rFonts w:ascii="Times New Roman" w:hAnsi="Times New Roman"/>
+                <w:sz w:val="22"/>
+              </w:rPr>
+              <w:t>beta_daring+thompson+fuzzy</w:t>
+            </w:r>
+          </w:p>
+        </w:tc>
+        <w:tc>
+          <w:tcPr>
+            <w:tcW w:type="dxa" w:w="1474"/>
+          </w:tcPr>
+          <w:p>
+            <w:pPr>
+              <w:jc w:val="left"/>
+            </w:pPr>
+            <w:r/>
+            <w:r>
+              <w:rPr>
+                <w:rFonts w:ascii="Times New Roman" w:hAnsi="Times New Roman"/>
+                <w:sz w:val="22"/>
+              </w:rPr>
+              <w:t>1.498</w:t>
+            </w:r>
+          </w:p>
+        </w:tc>
+        <w:tc>
+          <w:tcPr>
+            <w:tcW w:type="dxa" w:w="1814"/>
+          </w:tcPr>
+          <w:p>
+            <w:pPr>
+              <w:jc w:val="left"/>
+            </w:pPr>
+            <w:r/>
+            <w:r>
+              <w:rPr>
+                <w:rFonts w:ascii="Times New Roman" w:hAnsi="Times New Roman"/>
+                <w:sz w:val="22"/>
+              </w:rPr>
+              <w:t>0,1606</w:t>
+            </w:r>
+          </w:p>
+        </w:tc>
+        <w:tc>
+          <w:tcPr>
+            <w:tcW w:type="dxa" w:w="1474"/>
+          </w:tcPr>
+          <w:p>
+            <w:pPr>
+              <w:jc w:val="left"/>
+            </w:pPr>
+            <w:r/>
+            <w:r>
+              <w:rPr>
+                <w:rFonts w:ascii="Times New Roman" w:hAnsi="Times New Roman"/>
+                <w:sz w:val="22"/>
+              </w:rPr>
+              <w:t>1,0424</w:t>
+            </w:r>
+          </w:p>
+        </w:tc>
+      </w:tr>
+      <w:tr>
+        <w:tc>
+          <w:tcPr>
+            <w:tcW w:type="dxa" w:w="3288"/>
+          </w:tcPr>
+          <w:p>
+            <w:pPr>
+              <w:jc w:val="left"/>
+            </w:pPr>
+            <w:r/>
+            <w:r>
+              <w:rPr>
+                <w:rFonts w:ascii="Times New Roman" w:hAnsi="Times New Roman"/>
+                <w:sz w:val="22"/>
+              </w:rPr>
+              <w:t>beta_konteks+thompson</w:t>
+            </w:r>
+          </w:p>
+        </w:tc>
+        <w:tc>
+          <w:tcPr>
+            <w:tcW w:type="dxa" w:w="1474"/>
+          </w:tcPr>
+          <w:p>
+            <w:pPr>
+              <w:jc w:val="left"/>
+            </w:pPr>
+            <w:r/>
+            <w:r>
+              <w:rPr>
+                <w:rFonts w:ascii="Times New Roman" w:hAnsi="Times New Roman"/>
+                <w:sz w:val="22"/>
+              </w:rPr>
+              <w:t>1.499</w:t>
+            </w:r>
+          </w:p>
+        </w:tc>
+        <w:tc>
+          <w:tcPr>
+            <w:tcW w:type="dxa" w:w="1814"/>
+          </w:tcPr>
+          <w:p>
+            <w:pPr>
+              <w:jc w:val="left"/>
+            </w:pPr>
+            <w:r/>
+            <w:r>
+              <w:rPr>
+                <w:rFonts w:ascii="Times New Roman" w:hAnsi="Times New Roman"/>
+                <w:sz w:val="22"/>
+              </w:rPr>
+              <w:t>0,1607</w:t>
+            </w:r>
+          </w:p>
+        </w:tc>
+        <w:tc>
+          <w:tcPr>
+            <w:tcW w:type="dxa" w:w="1474"/>
+          </w:tcPr>
+          <w:p>
+            <w:pPr>
+              <w:jc w:val="left"/>
+            </w:pPr>
+            <w:r/>
+            <w:r>
+              <w:rPr>
+                <w:rFonts w:ascii="Times New Roman" w:hAnsi="Times New Roman"/>
+                <w:sz w:val="22"/>
+              </w:rPr>
+              <w:t>1,0585</w:t>
+            </w:r>
+          </w:p>
+        </w:tc>
+      </w:tr>
+      <w:tr>
+        <w:tc>
+          <w:tcPr>
+            <w:tcW w:type="dxa" w:w="3288"/>
+          </w:tcPr>
+          <w:p>
+            <w:pPr>
+              <w:jc w:val="left"/>
+            </w:pPr>
             <w:r/>
             <w:r>
               <w:rPr>
@@ -2427,46 +4045,55 @@
         </w:tc>
         <w:tc>
           <w:tcPr>
-            <w:tcW w:type="dxa" w:w="1701"/>
+            <w:tcW w:type="dxa" w:w="1474"/>
           </w:tcPr>
           <w:p>
+            <w:pPr>
+              <w:jc w:val="left"/>
+            </w:pPr>
             <w:r/>
             <w:r>
               <w:rPr>
                 <w:rFonts w:ascii="Times New Roman" w:hAnsi="Times New Roman"/>
                 <w:sz w:val="22"/>
               </w:rPr>
-              <w:t>1519</w:t>
+              <w:t>1.507</w:t>
             </w:r>
           </w:p>
         </w:tc>
         <w:tc>
           <w:tcPr>
-            <w:tcW w:type="dxa" w:w="1984"/>
+            <w:tcW w:type="dxa" w:w="1814"/>
           </w:tcPr>
           <w:p>
+            <w:pPr>
+              <w:jc w:val="left"/>
+            </w:pPr>
             <w:r/>
             <w:r>
               <w:rPr>
                 <w:rFonts w:ascii="Times New Roman" w:hAnsi="Times New Roman"/>
                 <w:sz w:val="22"/>
               </w:rPr>
-              <w:t>0,1628</w:t>
+              <w:t>0,1616</w:t>
             </w:r>
           </w:p>
         </w:tc>
         <w:tc>
           <w:tcPr>
-            <w:tcW w:type="dxa" w:w="1417"/>
+            <w:tcW w:type="dxa" w:w="1474"/>
           </w:tcPr>
           <w:p>
+            <w:pPr>
+              <w:jc w:val="left"/>
+            </w:pPr>
             <w:r/>
             <w:r>
               <w:rPr>
                 <w:rFonts w:ascii="Times New Roman" w:hAnsi="Times New Roman"/>
                 <w:sz w:val="22"/>
               </w:rPr>
-              <w:t>0,771</w:t>
+              <w:t>1,0626</w:t>
             </w:r>
           </w:p>
         </w:tc>
@@ -2474,61 +4101,73 @@
       <w:tr>
         <w:tc>
           <w:tcPr>
-            <w:tcW w:type="dxa" w:w="3118"/>
+            <w:tcW w:type="dxa" w:w="3288"/>
           </w:tcPr>
           <w:p>
+            <w:pPr>
+              <w:jc w:val="left"/>
+            </w:pPr>
             <w:r/>
             <w:r>
               <w:rPr>
                 <w:rFonts w:ascii="Times New Roman" w:hAnsi="Times New Roman"/>
                 <w:sz w:val="22"/>
               </w:rPr>
-              <w:t>pohon_bootstrap+thompson</w:t>
+              <w:t>beta_daring+greedy+fuzzy</w:t>
             </w:r>
           </w:p>
         </w:tc>
         <w:tc>
           <w:tcPr>
-            <w:tcW w:type="dxa" w:w="1701"/>
+            <w:tcW w:type="dxa" w:w="1474"/>
           </w:tcPr>
           <w:p>
+            <w:pPr>
+              <w:jc w:val="left"/>
+            </w:pPr>
             <w:r/>
             <w:r>
               <w:rPr>
                 <w:rFonts w:ascii="Times New Roman" w:hAnsi="Times New Roman"/>
                 <w:sz w:val="22"/>
               </w:rPr>
-              <w:t>1717</w:t>
+              <w:t>1.550</w:t>
             </w:r>
           </w:p>
         </w:tc>
         <w:tc>
           <w:tcPr>
-            <w:tcW w:type="dxa" w:w="1984"/>
+            <w:tcW w:type="dxa" w:w="1814"/>
           </w:tcPr>
           <w:p>
+            <w:pPr>
+              <w:jc w:val="left"/>
+            </w:pPr>
             <w:r/>
             <w:r>
               <w:rPr>
                 <w:rFonts w:ascii="Times New Roman" w:hAnsi="Times New Roman"/>
                 <w:sz w:val="22"/>
               </w:rPr>
-              <w:t>0,1841</w:t>
+              <w:t>0,1662</w:t>
             </w:r>
           </w:p>
         </w:tc>
         <w:tc>
           <w:tcPr>
-            <w:tcW w:type="dxa" w:w="1417"/>
+            <w:tcW w:type="dxa" w:w="1474"/>
           </w:tcPr>
           <w:p>
+            <w:pPr>
+              <w:jc w:val="left"/>
+            </w:pPr>
             <w:r/>
             <w:r>
               <w:rPr>
                 <w:rFonts w:ascii="Times New Roman" w:hAnsi="Times New Roman"/>
                 <w:sz w:val="22"/>
               </w:rPr>
-              <w:t>0,750</w:t>
+              <w:t>1,0426</w:t>
             </w:r>
           </w:p>
         </w:tc>
@@ -2536,9 +4175,86 @@
       <w:tr>
         <w:tc>
           <w:tcPr>
-            <w:tcW w:type="dxa" w:w="3118"/>
+            <w:tcW w:type="dxa" w:w="3288"/>
           </w:tcPr>
           <w:p>
+            <w:pPr>
+              <w:jc w:val="left"/>
+            </w:pPr>
+            <w:r/>
+            <w:r>
+              <w:rPr>
+                <w:rFonts w:ascii="Times New Roman" w:hAnsi="Times New Roman"/>
+                <w:sz w:val="22"/>
+              </w:rPr>
+              <w:t>topsis</w:t>
+            </w:r>
+          </w:p>
+        </w:tc>
+        <w:tc>
+          <w:tcPr>
+            <w:tcW w:type="dxa" w:w="1474"/>
+          </w:tcPr>
+          <w:p>
+            <w:pPr>
+              <w:jc w:val="left"/>
+            </w:pPr>
+            <w:r/>
+            <w:r>
+              <w:rPr>
+                <w:rFonts w:ascii="Times New Roman" w:hAnsi="Times New Roman"/>
+                <w:sz w:val="22"/>
+              </w:rPr>
+              <w:t>1.551</w:t>
+            </w:r>
+          </w:p>
+        </w:tc>
+        <w:tc>
+          <w:tcPr>
+            <w:tcW w:type="dxa" w:w="1814"/>
+          </w:tcPr>
+          <w:p>
+            <w:pPr>
+              <w:jc w:val="left"/>
+            </w:pPr>
+            <w:r/>
+            <w:r>
+              <w:rPr>
+                <w:rFonts w:ascii="Times New Roman" w:hAnsi="Times New Roman"/>
+                <w:sz w:val="22"/>
+              </w:rPr>
+              <w:t>0,1663</w:t>
+            </w:r>
+          </w:p>
+        </w:tc>
+        <w:tc>
+          <w:tcPr>
+            <w:tcW w:type="dxa" w:w="1474"/>
+          </w:tcPr>
+          <w:p>
+            <w:pPr>
+              <w:jc w:val="left"/>
+            </w:pPr>
+            <w:r/>
+            <w:r>
+              <w:rPr>
+                <w:rFonts w:ascii="Times New Roman" w:hAnsi="Times New Roman"/>
+                <w:sz w:val="22"/>
+              </w:rPr>
+              <w:t>1,0327</w:t>
+            </w:r>
+          </w:p>
+        </w:tc>
+      </w:tr>
+      <w:tr>
+        <w:tc>
+          <w:tcPr>
+            <w:tcW w:type="dxa" w:w="3288"/>
+          </w:tcPr>
+          <w:p>
+            <w:pPr>
+              <w:jc w:val="left"/>
+            </w:pPr>
             <w:r/>
             <w:r>
               <w:rPr>
@@ -2551,9 +4267,12 @@
         </w:tc>
         <w:tc>
           <w:tcPr>
-            <w:tcW w:type="dxa" w:w="1701"/>
+            <w:tcW w:type="dxa" w:w="1474"/>
           </w:tcPr>
           <w:p>
+            <w:pPr>
+              <w:jc w:val="left"/>
+            </w:pPr>
             <w:r/>
             <w:r>
               <w:rPr>
@@ -2566,9 +4285,12 @@
         </w:tc>
         <w:tc>
           <w:tcPr>
-            <w:tcW w:type="dxa" w:w="1984"/>
+            <w:tcW w:type="dxa" w:w="1814"/>
           </w:tcPr>
           <w:p>
+            <w:pPr>
+              <w:jc w:val="left"/>
+            </w:pPr>
             <w:r/>
             <w:r>
               <w:rPr>
@@ -2581,16 +4303,19 @@
         </w:tc>
         <w:tc>
           <w:tcPr>
-            <w:tcW w:type="dxa" w:w="1417"/>
+            <w:tcW w:type="dxa" w:w="1474"/>
           </w:tcPr>
           <w:p>
+            <w:pPr>
+              <w:jc w:val="left"/>
+            </w:pPr>
             <w:r/>
             <w:r>
               <w:rPr>
                 <w:rFonts w:ascii="Times New Roman" w:hAnsi="Times New Roman"/>
                 <w:sz w:val="22"/>
               </w:rPr>
-              <w:t>0,7262</w:t>
+              <w:t>1,0482</w:t>
             </w:r>
           </w:p>
         </w:tc>
@@ -2598,9 +4323,12 @@
       <w:tr>
         <w:tc>
           <w:tcPr>
-            <w:tcW w:type="dxa" w:w="3118"/>
+            <w:tcW w:type="dxa" w:w="3288"/>
           </w:tcPr>
           <w:p>
+            <w:pPr>
+              <w:jc w:val="left"/>
+            </w:pPr>
             <w:r/>
             <w:r>
               <w:rPr>
@@ -2613,9 +4341,12 @@
         </w:tc>
         <w:tc>
           <w:tcPr>
-            <w:tcW w:type="dxa" w:w="1701"/>
+            <w:tcW w:type="dxa" w:w="1474"/>
           </w:tcPr>
           <w:p>
+            <w:pPr>
+              <w:jc w:val="left"/>
+            </w:pPr>
             <w:r/>
             <w:r>
               <w:rPr>
@@ -2628,9 +4359,12 @@
         </w:tc>
         <w:tc>
           <w:tcPr>
-            <w:tcW w:type="dxa" w:w="1984"/>
+            <w:tcW w:type="dxa" w:w="1814"/>
           </w:tcPr>
           <w:p>
+            <w:pPr>
+              <w:jc w:val="left"/>
+            </w:pPr>
             <w:r/>
             <w:r>
               <w:rPr>
@@ -2643,16 +4377,19 @@
         </w:tc>
         <w:tc>
           <w:tcPr>
-            <w:tcW w:type="dxa" w:w="1417"/>
+            <w:tcW w:type="dxa" w:w="1474"/>
           </w:tcPr>
           <w:p>
+            <w:pPr>
+              <w:jc w:val="left"/>
+            </w:pPr>
             <w:r/>
             <w:r>
               <w:rPr>
                 <w:rFonts w:ascii="Times New Roman" w:hAnsi="Times New Roman"/>
                 <w:sz w:val="22"/>
               </w:rPr>
-              <w:t>0,6922</w:t>
+              <w:t>1,0000</w:t>
             </w:r>
           </w:p>
         </w:tc>
@@ -2666,8 +4403,8 @@
       <w:r>
         <w:drawing>
           <wp:inline xmlns:a="http://schemas.openxmlformats.org/drawingml/2006/main" xmlns:pic="http://schemas.openxmlformats.org/drawingml/2006/picture">
-            <wp:extent cx="5220000" cy="2788244"/>
-            <wp:docPr id="4" name="Picture 4"/>
+            <wp:extent cx="5220000" cy="2882687"/>
+            <wp:docPr id="5" name="Picture 5"/>
             <wp:cNvGraphicFramePr>
               <a:graphicFrameLocks noChangeAspect="1"/>
             </wp:cNvGraphicFramePr>
@@ -2675,11 +4412,11 @@
               <a:graphicData uri="http://schemas.openxmlformats.org/drawingml/2006/picture">
                 <pic:pic>
                   <pic:nvPicPr>
-                    <pic:cNvPr id="0" name="mesin2_regret.png"/>
+                    <pic:cNvPr id="0" name="mesin2_kompromi.png"/>
                     <pic:cNvPicPr/>
                   </pic:nvPicPr>
                   <pic:blipFill>
-                    <a:blip r:embed="rId12"/>
+                    <a:blip r:embed="rId13"/>
                     <a:stretch>
                       <a:fillRect/>
                     </a:stretch>
@@ -2687,7 +4424,7 @@
                   <pic:spPr>
                     <a:xfrm>
                       <a:off x="0" y="0"/>
-                      <a:ext cx="5220000" cy="2788244"/>
+                      <a:ext cx="5220000" cy="2882687"/>
                     </a:xfrm>
                     <a:prstGeom prst="rect"/>
                   </pic:spPr>
@@ -2708,7 +4445,7 @@
           <w:i/>
           <w:sz w:val="20"/>
         </w:rPr>
-        <w:t>Regret kumulatif 400 hari. Makin landai makin baik.</w:t>
+        <w:t>Keandalan melawan harga per kebijakan.</w:t>
       </w:r>
     </w:p>
     <w:p>
@@ -2721,7 +4458,67 @@
           <w:b/>
           <w:sz w:val="24"/>
         </w:rPr>
-        <w:t>TEMUAN 1: selalu termurah kalah dari memilih acak.</w:t>
+        <w:t>TEMUAN.</w:t>
+      </w:r>
+    </w:p>
+    <w:p>
+      <w:pPr>
+        <w:pStyle w:val="ListBullet"/>
+        <w:jc w:val="both"/>
+      </w:pPr>
+      <w:r>
+        <w:rPr>
+          <w:rFonts w:ascii="Times New Roman" w:hAnsi="Times New Roman"/>
+          <w:sz w:val="24"/>
+        </w:rPr>
+        <w:t>Beta-Bernoulli mengalahkan regresi logistik dan BART. Metode paling sederhana menang; BART menjadi pembanding saja.</w:t>
+      </w:r>
+    </w:p>
+    <w:p>
+      <w:pPr>
+        <w:pStyle w:val="ListBullet"/>
+        <w:jc w:val="both"/>
+      </w:pPr>
+      <w:r>
+        <w:rPr>
+          <w:rFonts w:ascii="Times New Roman" w:hAnsi="Times New Roman"/>
+          <w:sz w:val="24"/>
+        </w:rPr>
+        <w:t>Fuzzy di atas Beta+Thompson lebih andal daripada TOPSIS, dengan harga hanya sedikit lebih mahal.</w:t>
+      </w:r>
+    </w:p>
+    <w:p>
+      <w:pPr>
+        <w:pStyle w:val="ListBullet"/>
+        <w:jc w:val="both"/>
+      </w:pPr>
+      <w:r>
+        <w:rPr>
+          <w:rFonts w:ascii="Times New Roman" w:hAnsi="Times New Roman"/>
+          <w:sz w:val="24"/>
+        </w:rPr>
+        <w:t>Selalu termurah kalah dari memilih acak — premis Mesin 2. Sebagian karena rancangan dataset kami sendiri.</w:t>
+      </w:r>
+    </w:p>
+    <w:p>
+      <w:pPr>
+        <w:pStyle w:val="ListBullet"/>
+        <w:jc w:val="both"/>
+      </w:pPr>
+      <w:r>
+        <w:rPr>
+          <w:rFonts w:ascii="Times New Roman" w:hAnsi="Times New Roman"/>
+          <w:sz w:val="24"/>
+        </w:rPr>
+        <w:t>Eksplorasi hampir tidak membayar dirinya sendiri: reputasi distributor dipakai bersama 70 UMKM. Thompson tetap dipasang untuk distributor baru.</w:t>
+      </w:r>
+    </w:p>
+    <w:p>
+      <w:pPr>
+        <w:pStyle w:val="Heading1"/>
+      </w:pPr>
+      <w:r>
+        <w:t>G. Profil pelanggan distributor — bagian 8</w:t>
       </w:r>
     </w:p>
     <w:p>
@@ -2734,20 +4531,7 @@
           <w:b w:val="0"/>
           <w:sz w:val="24"/>
         </w:rPr>
-        <w:t>Premis Mesin 2 terbukti di dataset ini. Tetapi premis itu sebagian hasil rancangan kami sendiri: kamilah yang membuat distributor termurah menjadi yang terburuk.</w:t>
-      </w:r>
-    </w:p>
-    <w:p>
-      <w:pPr>
-        <w:jc w:val="both"/>
-      </w:pPr>
-      <w:r>
-        <w:rPr>
-          <w:rFonts w:ascii="Times New Roman" w:hAnsi="Times New Roman"/>
-          <w:b/>
-          <w:sz w:val="24"/>
-        </w:rPr>
-        <w:t>TEMUAN 2: eksplorasi hampir tidak membayar dirinya sendiri.</w:t>
+        <w:t>Sebelumnya disebut Mesin 3. Namanya diganti supaya tidak tertukar dengan segmentasi distributor (Mesin 2). Ini fitur pendukung portal distributor: siapa pelanggan yang harus dijaga, siapa yang mulai menghilang, siapa yang baru.</w:t>
       </w:r>
     </w:p>
     <w:p>
@@ -2760,80 +4544,7 @@
           <w:b w:val="0"/>
           <w:sz w:val="24"/>
         </w:rPr>
-        <w:t>Keempat kebijakan berakhir di regret yang nyaris sama, padahal pilihannya memang berbeda (epsilon-greedy berbeda dari greedy pada ~13 persen keputusan, Thompson ~17 persen). Sebabnya: hanya ada delapan distributor, dan reputasi mereka dipakai bersama oleh 70 UMKM, sehingga masalah awal-dingin selesai dalam beberapa pekan. Lapis eksplorasi tetap dipasang karena ia diperlukan untuk hal yang tidak muncul di simulasi: distributor baru yang mendaftar setelah sistem berjalan.</w:t>
-      </w:r>
-    </w:p>
-    <w:p>
-      <w:pPr>
-        <w:pStyle w:val="Heading1"/>
-      </w:pPr>
-      <w:r>
-        <w:t>G. Mesin 3 — segmentasi pelanggan — bagian 8</w:t>
-      </w:r>
-    </w:p>
-    <w:p>
-      <w:pPr>
-        <w:jc w:val="both"/>
-      </w:pPr>
-      <w:r>
-        <w:rPr>
-          <w:rFonts w:ascii="Times New Roman" w:hAnsi="Times New Roman"/>
-          <w:b/>
-          <w:sz w:val="24"/>
-        </w:rPr>
-        <w:t>Yang dijawabnya.</w:t>
-      </w:r>
-    </w:p>
-    <w:p>
-      <w:pPr>
-        <w:jc w:val="both"/>
-      </w:pPr>
-      <w:r>
-        <w:rPr>
-          <w:rFonts w:ascii="Times New Roman" w:hAnsi="Times New Roman"/>
-          <w:b w:val="0"/>
-          <w:sz w:val="24"/>
-        </w:rPr>
-        <w:t>Dari sekian UMKM yang pernah memesan ke saya, siapa yang harus saya jaga, siapa yang mulai menghilang, siapa yang baru. Ini mesin untuk portal distributor.</w:t>
-      </w:r>
-    </w:p>
-    <w:p>
-      <w:pPr>
-        <w:jc w:val="both"/>
-      </w:pPr>
-      <w:r>
-        <w:rPr>
-          <w:rFonts w:ascii="Times New Roman" w:hAnsi="Times New Roman"/>
-          <w:b/>
-          <w:sz w:val="24"/>
-        </w:rPr>
-        <w:t>Kenapa K-Prototypes dan bukan K-Means.</w:t>
-      </w:r>
-    </w:p>
-    <w:p>
-      <w:pPr>
-        <w:jc w:val="both"/>
-      </w:pPr>
-      <w:r>
-        <w:rPr>
-          <w:rFonts w:ascii="Times New Roman" w:hAnsi="Times New Roman"/>
-          <w:b w:val="0"/>
-          <w:sz w:val="24"/>
-        </w:rPr>
-        <w:t>Fiturnya campuran angka dan kategori. K-Means tidak bisa menghitung jarak antara kedai kopi dan warung makan. K-Prototypes menjumlahkan dua jenis jarak dengan bobot gamma; pusat kelompoknya rata-rata untuk angka dan modus untuk kategori.</w:t>
-      </w:r>
-    </w:p>
-    <w:p>
-      <w:pPr>
-        <w:jc w:val="both"/>
-      </w:pPr>
-      <w:r>
-        <w:rPr>
-          <w:rFonts w:ascii="Times New Roman" w:hAnsi="Times New Roman"/>
-          <w:b w:val="0"/>
-          <w:sz w:val="24"/>
-        </w:rPr>
-        <w:t>Hasil: 408 pelanggan tersegmen di 8 distributor, jumlah kelompok dipilih dengan skor siluet.</w:t>
+        <w:t>K-Prototypes, karena fiturnya campuran angka (RFM) dan kategori (jenis usaha); K-Means tidak bisa menghitung jarak antara kedai kopi dan warung makan. Hasil: 408 pelanggan di 8 distributor, jumlah kelompok dipilih dengan skor siluet.</w:t>
       </w:r>
     </w:p>
     <w:p>
@@ -2844,7 +4555,7 @@
         <w:drawing>
           <wp:inline xmlns:a="http://schemas.openxmlformats.org/drawingml/2006/main" xmlns:pic="http://schemas.openxmlformats.org/drawingml/2006/picture">
             <wp:extent cx="5220000" cy="1700117"/>
-            <wp:docPr id="5" name="Picture 5"/>
+            <wp:docPr id="6" name="Picture 6"/>
             <wp:cNvGraphicFramePr>
               <a:graphicFrameLocks noChangeAspect="1"/>
             </wp:cNvGraphicFramePr>
@@ -2856,7 +4567,7 @@
                     <pic:cNvPicPr/>
                   </pic:nvPicPr>
                   <pic:blipFill>
-                    <a:blip r:embed="rId13"/>
+                    <a:blip r:embed="rId14"/>
                     <a:stretch>
                       <a:fillRect/>
                     </a:stretch>
@@ -2885,20 +4596,7 @@
           <w:i/>
           <w:sz w:val="20"/>
         </w:rPr>
-        <w:t>Sebaran segmen dan posisi RFM rata-ratanya.</w:t>
-      </w:r>
-    </w:p>
-    <w:p>
-      <w:pPr>
-        <w:jc w:val="both"/>
-      </w:pPr>
-      <w:r>
-        <w:rPr>
-          <w:rFonts w:ascii="Times New Roman" w:hAnsi="Times New Roman"/>
-          <w:b w:val="0"/>
-          <w:sz w:val="24"/>
-        </w:rPr>
-        <w:t>Keluarannya kelompok bernama dengan satu kalimat ciri dan satu kalimat saran tindakan, bukan nomor kelompok — nomor kelompok tidak bisa dipakai siapa pun.</w:t>
+        <w:t>Sebaran kelompok pelanggan dan posisi RFM rata-ratanya.</w:t>
       </w:r>
     </w:p>
     <w:p>
@@ -2919,7 +4617,7 @@
           <w:b w:val="0"/>
           <w:sz w:val="24"/>
         </w:rPr>
-        <w:t>37 uji, semuanya lulus.</w:t>
+        <w:t>83 uji, semuanya lulus.</w:t>
       </w:r>
     </w:p>
     <w:tbl>
@@ -2939,6 +4637,9 @@
             <w:tcW w:type="dxa" w:w="2268"/>
           </w:tcPr>
           <w:p>
+            <w:pPr>
+              <w:jc w:val="left"/>
+            </w:pPr>
             <w:r/>
             <w:r>
               <w:rPr>
@@ -2955,6 +4656,9 @@
             <w:tcW w:type="dxa" w:w="6236"/>
           </w:tcPr>
           <w:p>
+            <w:pPr>
+              <w:jc w:val="left"/>
+            </w:pPr>
             <w:r/>
             <w:r>
               <w:rPr>
@@ -2973,6 +4677,9 @@
             <w:tcW w:type="dxa" w:w="2268"/>
           </w:tcPr>
           <w:p>
+            <w:pPr>
+              <w:jc w:val="left"/>
+            </w:pPr>
             <w:r/>
             <w:r>
               <w:rPr>
@@ -2988,6 +4695,9 @@
             <w:tcW w:type="dxa" w:w="6236"/>
           </w:tcPr>
           <w:p>
+            <w:pPr>
+              <w:jc w:val="left"/>
+            </w:pPr>
             <w:r/>
             <w:r>
               <w:rPr>
@@ -3005,6 +4715,9 @@
             <w:tcW w:type="dxa" w:w="2268"/>
           </w:tcPr>
           <w:p>
+            <w:pPr>
+              <w:jc w:val="left"/>
+            </w:pPr>
             <w:r/>
             <w:r>
               <w:rPr>
@@ -3020,6 +4733,9 @@
             <w:tcW w:type="dxa" w:w="6236"/>
           </w:tcPr>
           <w:p>
+            <w:pPr>
+              <w:jc w:val="left"/>
+            </w:pPr>
             <w:r/>
             <w:r>
               <w:rPr>
@@ -3037,6 +4753,9 @@
             <w:tcW w:type="dxa" w:w="2268"/>
           </w:tcPr>
           <w:p>
+            <w:pPr>
+              <w:jc w:val="left"/>
+            </w:pPr>
             <w:r/>
             <w:r>
               <w:rPr>
@@ -3052,6 +4771,9 @@
             <w:tcW w:type="dxa" w:w="6236"/>
           </w:tcPr>
           <w:p>
+            <w:pPr>
+              <w:jc w:val="left"/>
+            </w:pPr>
             <w:r/>
             <w:r>
               <w:rPr>
@@ -3069,6 +4791,9 @@
             <w:tcW w:type="dxa" w:w="2268"/>
           </w:tcPr>
           <w:p>
+            <w:pPr>
+              <w:jc w:val="left"/>
+            </w:pPr>
             <w:r/>
             <w:r>
               <w:rPr>
@@ -3084,6 +4809,9 @@
             <w:tcW w:type="dxa" w:w="6236"/>
           </w:tcPr>
           <w:p>
+            <w:pPr>
+              <w:jc w:val="left"/>
+            </w:pPr>
             <w:r/>
             <w:r>
               <w:rPr>
@@ -3091,6 +4819,82 @@
                 <w:sz w:val="22"/>
               </w:rPr>
               <w:t>Dua pintu, dua token, penjagaan alamat</w:t>
+            </w:r>
+          </w:p>
+        </w:tc>
+      </w:tr>
+      <w:tr>
+        <w:tc>
+          <w:tcPr>
+            <w:tcW w:type="dxa" w:w="2268"/>
+          </w:tcPr>
+          <w:p>
+            <w:pPr>
+              <w:jc w:val="left"/>
+            </w:pPr>
+            <w:r/>
+            <w:r>
+              <w:rPr>
+                <w:rFonts w:ascii="Times New Roman" w:hAnsi="Times New Roman"/>
+                <w:sz w:val="22"/>
+              </w:rPr>
+              <w:t>test_mesin1_saringan.py</w:t>
+            </w:r>
+          </w:p>
+        </w:tc>
+        <w:tc>
+          <w:tcPr>
+            <w:tcW w:type="dxa" w:w="6236"/>
+          </w:tcPr>
+          <w:p>
+            <w:pPr>
+              <w:jc w:val="left"/>
+            </w:pPr>
+            <w:r/>
+            <w:r>
+              <w:rPr>
+                <w:rFonts w:ascii="Times New Roman" w:hAnsi="Times New Roman"/>
+                <w:sz w:val="22"/>
+              </w:rPr>
+              <w:t>MAPE dan skala Lewis, Syntetos–Boylan, ABC menurut nilai, Mahalanobis dan Lebaran</w:t>
+            </w:r>
+          </w:p>
+        </w:tc>
+      </w:tr>
+      <w:tr>
+        <w:tc>
+          <w:tcPr>
+            <w:tcW w:type="dxa" w:w="2268"/>
+          </w:tcPr>
+          <w:p>
+            <w:pPr>
+              <w:jc w:val="left"/>
+            </w:pPr>
+            <w:r/>
+            <w:r>
+              <w:rPr>
+                <w:rFonts w:ascii="Times New Roman" w:hAnsi="Times New Roman"/>
+                <w:sz w:val="22"/>
+              </w:rPr>
+              <w:t>test_mesin2_sederhana.py</w:t>
+            </w:r>
+          </w:p>
+        </w:tc>
+        <w:tc>
+          <w:tcPr>
+            <w:tcW w:type="dxa" w:w="6236"/>
+          </w:tcPr>
+          <w:p>
+            <w:pPr>
+              <w:jc w:val="left"/>
+            </w:pPr>
+            <w:r/>
+            <w:r>
+              <w:rPr>
+                <w:rFonts w:ascii="Times New Roman" w:hAnsi="Times New Roman"/>
+                <w:sz w:val="22"/>
+              </w:rPr>
+              <w:t>Pembaruan Beta, contoh Beta(46, 6) vs Beta(3, 1), fuzzy 0,7625</w:t>
             </w:r>
           </w:p>
         </w:tc>
@@ -3167,7 +4971,20 @@
           <w:rFonts w:ascii="Times New Roman" w:hAnsi="Times New Roman"/>
           <w:sz w:val="24"/>
         </w:rPr>
-        <w:t>Bahwa model pondasi tidak berguna — dataset kami menguntungkan metode klasik secara struktural.</w:t>
+        <w:t>Bahwa ETS lebih baik daripada model pondasi secara umum — dataset kami menguntungkan metode klasik secara struktural.</w:t>
+      </w:r>
+    </w:p>
+    <w:p>
+      <w:pPr>
+        <w:pStyle w:val="ListBullet"/>
+        <w:jc w:val="both"/>
+      </w:pPr>
+      <w:r>
+        <w:rPr>
+          <w:rFonts w:ascii="Times New Roman" w:hAnsi="Times New Roman"/>
+          <w:sz w:val="24"/>
+        </w:rPr>
+        <w:t>Bahwa sasaran 5 persen mustahil — ia belum tercapai pada tingkat barang per pekan; pada tingkat yang lebih kasar jaraknya lebih kecil.</w:t>
       </w:r>
     </w:p>
     <w:p>
@@ -3234,6 +5051,9 @@
             <w:tcW w:type="dxa" w:w="2835"/>
           </w:tcPr>
           <w:p>
+            <w:pPr>
+              <w:jc w:val="left"/>
+            </w:pPr>
             <w:r/>
             <w:r>
               <w:rPr>
@@ -3250,6 +5070,9 @@
             <w:tcW w:type="dxa" w:w="5669"/>
           </w:tcPr>
           <w:p>
+            <w:pPr>
+              <w:jc w:val="left"/>
+            </w:pPr>
             <w:r/>
             <w:r>
               <w:rPr>
@@ -3268,6 +5091,9 @@
             <w:tcW w:type="dxa" w:w="2835"/>
           </w:tcPr>
           <w:p>
+            <w:pPr>
+              <w:jc w:val="left"/>
+            </w:pPr>
             <w:r/>
             <w:r>
               <w:rPr>
@@ -3283,6 +5109,9 @@
             <w:tcW w:type="dxa" w:w="5669"/>
           </w:tcPr>
           <w:p>
+            <w:pPr>
+              <w:jc w:val="left"/>
+            </w:pPr>
             <w:r/>
             <w:r>
               <w:rPr>
@@ -3300,6 +5129,9 @@
             <w:tcW w:type="dxa" w:w="2835"/>
           </w:tcPr>
           <w:p>
+            <w:pPr>
+              <w:jc w:val="left"/>
+            </w:pPr>
             <w:r/>
             <w:r>
               <w:rPr>
@@ -3315,6 +5147,9 @@
             <w:tcW w:type="dxa" w:w="5669"/>
           </w:tcPr>
           <w:p>
+            <w:pPr>
+              <w:jc w:val="left"/>
+            </w:pPr>
             <w:r/>
             <w:r>
               <w:rPr>
@@ -3332,6 +5167,9 @@
             <w:tcW w:type="dxa" w:w="2835"/>
           </w:tcPr>
           <w:p>
+            <w:pPr>
+              <w:jc w:val="left"/>
+            </w:pPr>
             <w:r/>
             <w:r>
               <w:rPr>
@@ -3347,6 +5185,9 @@
             <w:tcW w:type="dxa" w:w="5669"/>
           </w:tcPr>
           <w:p>
+            <w:pPr>
+              <w:jc w:val="left"/>
+            </w:pPr>
             <w:r/>
             <w:r>
               <w:rPr>
@@ -3364,6 +5205,9 @@
             <w:tcW w:type="dxa" w:w="2835"/>
           </w:tcPr>
           <w:p>
+            <w:pPr>
+              <w:jc w:val="left"/>
+            </w:pPr>
             <w:r/>
             <w:r>
               <w:rPr>
@@ -3379,6 +5223,9 @@
             <w:tcW w:type="dxa" w:w="5669"/>
           </w:tcPr>
           <w:p>
+            <w:pPr>
+              <w:jc w:val="left"/>
+            </w:pPr>
             <w:r/>
             <w:r>
               <w:rPr>
@@ -3396,6 +5243,9 @@
             <w:tcW w:type="dxa" w:w="2835"/>
           </w:tcPr>
           <w:p>
+            <w:pPr>
+              <w:jc w:val="left"/>
+            </w:pPr>
             <w:r/>
             <w:r>
               <w:rPr>
@@ -3411,6 +5261,9 @@
             <w:tcW w:type="dxa" w:w="5669"/>
           </w:tcPr>
           <w:p>
+            <w:pPr>
+              <w:jc w:val="left"/>
+            </w:pPr>
             <w:r/>
             <w:r>
               <w:rPr>
@@ -3428,6 +5281,9 @@
             <w:tcW w:type="dxa" w:w="2835"/>
           </w:tcPr>
           <w:p>
+            <w:pPr>
+              <w:jc w:val="left"/>
+            </w:pPr>
             <w:r/>
             <w:r>
               <w:rPr>
@@ -3443,6 +5299,9 @@
             <w:tcW w:type="dxa" w:w="5669"/>
           </w:tcPr>
           <w:p>
+            <w:pPr>
+              <w:jc w:val="left"/>
+            </w:pPr>
             <w:r/>
             <w:r>
               <w:rPr>
@@ -3460,6 +5319,9 @@
             <w:tcW w:type="dxa" w:w="2835"/>
           </w:tcPr>
           <w:p>
+            <w:pPr>
+              <w:jc w:val="left"/>
+            </w:pPr>
             <w:r/>
             <w:r>
               <w:rPr>
@@ -3475,13 +5337,130 @@
             <w:tcW w:type="dxa" w:w="5669"/>
           </w:tcPr>
           <w:p>
+            <w:pPr>
+              <w:jc w:val="left"/>
+            </w:pPr>
             <w:r/>
             <w:r>
               <w:rPr>
                 <w:rFonts w:ascii="Times New Roman" w:hAnsi="Times New Roman"/>
                 <w:sz w:val="22"/>
               </w:rPr>
-              <w:t>Seluruh angka dari simulasi</w:t>
+              <w:t>Angka Warungku dari simulasi; satu toko roti nyata untuk menguji metode omset</w:t>
+            </w:r>
+          </w:p>
+        </w:tc>
+      </w:tr>
+      <w:tr>
+        <w:tc>
+          <w:tcPr>
+            <w:tcW w:type="dxa" w:w="2835"/>
+          </w:tcPr>
+          <w:p>
+            <w:pPr>
+              <w:jc w:val="left"/>
+            </w:pPr>
+            <w:r/>
+            <w:r>
+              <w:rPr>
+                <w:rFonts w:ascii="Times New Roman" w:hAnsi="Times New Roman"/>
+                <w:sz w:val="22"/>
+              </w:rPr>
+              <w:t>Penanda stok mati</w:t>
+            </w:r>
+          </w:p>
+        </w:tc>
+        <w:tc>
+          <w:tcPr>
+            <w:tcW w:type="dxa" w:w="5669"/>
+          </w:tcPr>
+          <w:p>
+            <w:pPr>
+              <w:jc w:val="left"/>
+            </w:pPr>
+            <w:r/>
+            <w:r>
+              <w:rPr>
+                <w:rFonts w:ascii="Times New Roman" w:hAnsi="Times New Roman"/>
+                <w:sz w:val="22"/>
+              </w:rPr>
+              <w:t>Sell-through hanya cocok untuk ini; belum dibangun</w:t>
+            </w:r>
+          </w:p>
+        </w:tc>
+      </w:tr>
+      <w:tr>
+        <w:tc>
+          <w:tcPr>
+            <w:tcW w:type="dxa" w:w="2835"/>
+          </w:tcPr>
+          <w:p>
+            <w:pPr>
+              <w:jc w:val="left"/>
+            </w:pPr>
+            <w:r/>
+            <w:r>
+              <w:rPr>
+                <w:rFonts w:ascii="Times New Roman" w:hAnsi="Times New Roman"/>
+                <w:sz w:val="22"/>
+              </w:rPr>
+              <w:t>MAPE 5 persen</w:t>
+            </w:r>
+          </w:p>
+        </w:tc>
+        <w:tc>
+          <w:tcPr>
+            <w:tcW w:type="dxa" w:w="5669"/>
+          </w:tcPr>
+          <w:p>
+            <w:pPr>
+              <w:jc w:val="left"/>
+            </w:pPr>
+            <w:r/>
+            <w:r>
+              <w:rPr>
+                <w:rFonts w:ascii="Times New Roman" w:hAnsi="Times New Roman"/>
+                <w:sz w:val="22"/>
+              </w:rPr>
+              <w:t>Belum tercapai pada tingkat barang per pekan</w:t>
+            </w:r>
+          </w:p>
+        </w:tc>
+      </w:tr>
+      <w:tr>
+        <w:tc>
+          <w:tcPr>
+            <w:tcW w:type="dxa" w:w="2835"/>
+          </w:tcPr>
+          <w:p>
+            <w:pPr>
+              <w:jc w:val="left"/>
+            </w:pPr>
+            <w:r/>
+            <w:r>
+              <w:rPr>
+                <w:rFonts w:ascii="Times New Roman" w:hAnsi="Times New Roman"/>
+                <w:sz w:val="22"/>
+              </w:rPr>
+              <w:t>Ramalan omset di aplikasi</w:t>
+            </w:r>
+          </w:p>
+        </w:tc>
+        <w:tc>
+          <w:tcPr>
+            <w:tcW w:type="dxa" w:w="5669"/>
+          </w:tcPr>
+          <w:p>
+            <w:pPr>
+              <w:jc w:val="left"/>
+            </w:pPr>
+            <w:r/>
+            <w:r>
+              <w:rPr>
+                <w:rFonts w:ascii="Times New Roman" w:hAnsi="Times New Roman"/>
+                <w:sz w:val="22"/>
+              </w:rPr>
+              <w:t>Baru dievaluasi; belum ditulis ke basis data dan belum tampil</w:t>
             </w:r>
           </w:p>
         </w:tc>

</xml_diff>